<commit_message>
Add installation logs for LibreOffice and edited document
- Created libreoffice-install.err.log to capture error logs during installation.
- Created libreoffice-install.out.log to capture output logs, including version and dependency information.
- Added text-edited.docx, a document with significant edits (file size: 3079 KB).
</commit_message>
<xml_diff>
--- a/SENTINEL - Group 8.docx
+++ b/SENTINEL - Group 8.docx
@@ -775,27 +775,7 @@
           <w:lang w:val="en-US"/>
           <w14:ligatures w14:val="none"/>
         </w:rPr>
-        <w:t xml:space="preserve">Hanz </w:t>
-      </w:r>
-      <w:proofErr w:type="spellStart"/>
-      <w:r>
-        <w:rPr>
-          <w:rFonts w:ascii="Times New Roman" w:eastAsia="Times New Roman" w:hAnsi="Times New Roman" w:cs="Times New Roman"/>
-          <w:kern w:val="0"/>
-          <w:lang w:val="en-US"/>
-          <w14:ligatures w14:val="none"/>
-        </w:rPr>
-        <w:t>Lourenz</w:t>
-      </w:r>
-      <w:proofErr w:type="spellEnd"/>
-      <w:r>
-        <w:rPr>
-          <w:rFonts w:ascii="Times New Roman" w:eastAsia="Times New Roman" w:hAnsi="Times New Roman" w:cs="Times New Roman"/>
-          <w:kern w:val="0"/>
-          <w:lang w:val="en-US"/>
-          <w14:ligatures w14:val="none"/>
-        </w:rPr>
-        <w:t xml:space="preserve"> Frank J. Ribu</w:t>
+        <w:t>Hanz Lourenz Frank J. Ribu</w:t>
       </w:r>
     </w:p>
     <w:p>
@@ -3978,7 +3958,31 @@
           <w:kern w:val="0"/>
           <w14:ligatures w14:val="none"/>
         </w:rPr>
-        <w:t>SENTINEL is an integrated digital ecosystem designed to resolve these cumulative vulnerabilities by centralizing personnel profiles, firearm telemetry, and shift logs into a high-performance single source of truth. The system works by embedding real-time compliance checks into the daily operational workflow. Before a guard can be deployed, the system automatically verifies their license validity and firearm authorization against central records. To manage high-concurrency requests from hundreds of guards, SENTINEL utilizes the Rust programming language and the Axum framework, providing native memory safety and asynchronous performance that prevents the data races typical of legacy systems (Scofield, 2025). When an operational gap such as a missed check-in is detected, the system immediately flags the vacancy and identifies the nearest qualified replacement, ensuring that the agency moves from a reactive stance to a proactive, legally defensible model of security management.</w:t>
+        <w:t>SENTINEL is an integrated security operations platform designed to address these vulnerabilities by centralizing personnel profiles, firearm inventory and custody records, and shift logs into a unified source of operational data. The scheduling workflow validates that guards are approved and checks for conflicting assignments before a schedule is created. Firearm allocation separately validates firearm availability, permit status, and applicable firearms-handling training before normal issuance.</w:t>
+      </w:r>
+      <w:r>
+        <w:rPr>
+          <w:rFonts w:ascii="Times New Roman" w:eastAsia="Times New Roman" w:hAnsi="Times New Roman" w:cs="Times New Roman"/>
+          <w:kern w:val="0"/>
+          <w14:ligatures w14:val="none"/>
+        </w:rPr>
+        <w:t xml:space="preserve"> </w:t>
+      </w:r>
+      <w:r>
+        <w:rPr>
+          <w:rFonts w:ascii="Times New Roman" w:eastAsia="Times New Roman" w:hAnsi="Times New Roman" w:cs="Times New Roman"/>
+          <w:kern w:val="0"/>
+          <w14:ligatures w14:val="none"/>
+        </w:rPr>
+        <w:t>When a no-show condition is detected, SENTINEL can notify eligible guards and provide ranked replacement recommendations based on operational factors such as reliability, availability, permit status, and last-known distance. Authorized personnel or an eligible guard then confirm the reassignment.</w:t>
+      </w:r>
+      <w:r>
+        <w:rPr>
+          <w:rFonts w:ascii="Times New Roman" w:eastAsia="Times New Roman" w:hAnsi="Times New Roman" w:cs="Times New Roman"/>
+          <w:kern w:val="0"/>
+          <w14:ligatures w14:val="none"/>
+        </w:rPr>
+        <w:t xml:space="preserve"> To manage high-concurrency requests from hundreds of guards, SENTINEL utilizes the Rust programming language and the Axum framework, providing native memory safety and asynchronous performance that prevents the data races typical of legacy systems (Scofield, 2025).</w:t>
       </w:r>
     </w:p>
     <w:p>
@@ -4022,19 +4026,6 @@
     </w:p>
     <w:p>
       <w:pPr>
-        <w:widowControl w:val="0"/>
-        <w:spacing w:before="136" w:after="0" w:line="480" w:lineRule="auto"/>
-        <w:ind w:left="448" w:firstLine="641"/>
-        <w:jc w:val="both"/>
-        <w:rPr>
-          <w:rFonts w:ascii="Times New Roman" w:eastAsia="Times New Roman" w:hAnsi="Times New Roman" w:cs="Times New Roman"/>
-          <w:kern w:val="0"/>
-          <w14:ligatures w14:val="none"/>
-        </w:rPr>
-      </w:pPr>
-    </w:p>
-    <w:p>
-      <w:pPr>
         <w:pStyle w:val="TNRHeading2"/>
         <w:ind w:left="0" w:firstLine="440"/>
       </w:pPr>
@@ -4201,27 +4192,16 @@
           <w14:ligatures w14:val="none"/>
         </w:rPr>
         <w:lastRenderedPageBreak/>
-        <w:t xml:space="preserve">Security and governance controls are embedded as core functions, including secure session management, legal-policy acceptance gating, audit and forensic logging, rate limiting, and service-health monitoring. Cross-platform delivery across Web, Desktop, and Android </w:t>
-      </w:r>
-      <w:proofErr w:type="gramStart"/>
-      <w:r>
-        <w:rPr>
-          <w:rFonts w:ascii="Times New Roman" w:eastAsia="Times New Roman" w:hAnsi="Times New Roman" w:cs="Times New Roman"/>
-          <w:kern w:val="0"/>
-          <w:lang w:val="en-US"/>
-          <w14:ligatures w14:val="none"/>
-        </w:rPr>
-        <w:t>maintains</w:t>
-      </w:r>
-      <w:proofErr w:type="gramEnd"/>
-      <w:r>
-        <w:rPr>
-          <w:rFonts w:ascii="Times New Roman" w:eastAsia="Times New Roman" w:hAnsi="Times New Roman" w:cs="Times New Roman"/>
-          <w:kern w:val="0"/>
-          <w:lang w:val="en-US"/>
-          <w14:ligatures w14:val="none"/>
-        </w:rPr>
-        <w:t xml:space="preserve"> consistent behavior and policy enforcement across runtime environments, although some secondary workflows are still delivered through shared dashboard panels, tabs, and shell overlays rather than fully separated standalone pages.</w:t>
+        <w:t xml:space="preserve">Security and governance controls are embedded as core functions, including secure session management, legal-policy acceptance gating, audit and forensic logging, rate limiting, and service-health monitoring. </w:t>
+      </w:r>
+      <w:r>
+        <w:rPr>
+          <w:rFonts w:ascii="Times New Roman" w:eastAsia="Times New Roman" w:hAnsi="Times New Roman" w:cs="Times New Roman"/>
+          <w:kern w:val="0"/>
+          <w:lang w:val="en-US"/>
+          <w14:ligatures w14:val="none"/>
+        </w:rPr>
+        <w:t>The Web application serves as the currently implemented primary runtime. Windows desktop packaging through Tauri and Android packaging through Capacitor are configured as additional deployment targets. Packaged installer and signed-device validation remain necessary before full cross-platform parity can be established.</w:t>
       </w:r>
     </w:p>
     <w:p>
@@ -4281,7 +4261,7 @@
           <w:lang w:val="en-US"/>
           <w14:ligatures w14:val="none"/>
         </w:rPr>
-        <w:t>The main objective of this study is to develop a system named SENTINEL, an integrated, role-governed, multi-platform security operations management system for the stakeholders of Davao Security &amp; Intelligence Agency, Inc. The purpose of this system is to improve their workforce continuity, asset accountability, incident coordination, live monitoring, and governance visibility across Web, Desktop, and Android platforms.</w:t>
+        <w:t>The main objective of this study is to develop SENTINEL, an integrated, role-governed security operations management system for the stakeholders of Davao Security &amp; Investigation Agency, Inc. The system supports workforce continuity, asset accountability, incident coordination, operational monitoring, and governance visibility through an implemented Web application with configured Windows desktop and Android deployment targets.</w:t>
       </w:r>
     </w:p>
     <w:p>
@@ -4343,7 +4323,7 @@
         <w:pStyle w:val="ListParagraph"/>
         <w:widowControl w:val="0"/>
         <w:numPr>
-          <w:ilvl w:val="0"/>
+          <w:ilvl w:val="1"/>
           <w:numId w:val="40"/>
         </w:numPr>
         <w:spacing w:after="0" w:line="480" w:lineRule="auto"/>
@@ -4364,7 +4344,65 @@
           <w:lang w:val="en-US"/>
           <w14:ligatures w14:val="none"/>
         </w:rPr>
-        <w:t>Automate personnel operations, including scheduling, attendance, DTR generation, check-in/check-out, and replacement coordination.</w:t>
+        <w:t>Support administrator-mediated account onboarding, verification, approval, secure authentication, and password recovery.</w:t>
+      </w:r>
+    </w:p>
+    <w:p>
+      <w:pPr>
+        <w:pStyle w:val="ListParagraph"/>
+        <w:widowControl w:val="0"/>
+        <w:numPr>
+          <w:ilvl w:val="1"/>
+          <w:numId w:val="40"/>
+        </w:numPr>
+        <w:spacing w:after="0" w:line="480" w:lineRule="auto"/>
+        <w:jc w:val="both"/>
+        <w:rPr>
+          <w:rFonts w:ascii="Times New Roman" w:eastAsia="Times New Roman" w:hAnsi="Times New Roman" w:cs="Times New Roman"/>
+          <w:bCs/>
+          <w:kern w:val="0"/>
+          <w:lang w:val="en-US"/>
+          <w14:ligatures w14:val="none"/>
+        </w:rPr>
+      </w:pPr>
+      <w:r>
+        <w:rPr>
+          <w:rFonts w:ascii="Times New Roman" w:eastAsia="Times New Roman" w:hAnsi="Times New Roman" w:cs="Times New Roman"/>
+          <w:bCs/>
+          <w:kern w:val="0"/>
+          <w:lang w:val="en-US"/>
+          <w14:ligatures w14:val="none"/>
+        </w:rPr>
+        <w:t>Enforce role-based access and account-activation controls for Superadmin, Administrator, Supervisor, and Guard users.</w:t>
+      </w:r>
+    </w:p>
+    <w:p>
+      <w:pPr>
+        <w:pStyle w:val="ListParagraph"/>
+        <w:widowControl w:val="0"/>
+        <w:numPr>
+          <w:ilvl w:val="1"/>
+          <w:numId w:val="40"/>
+        </w:numPr>
+        <w:spacing w:after="0" w:line="480" w:lineRule="auto"/>
+        <w:jc w:val="both"/>
+        <w:rPr>
+          <w:rFonts w:ascii="Times New Roman" w:eastAsia="Times New Roman" w:hAnsi="Times New Roman" w:cs="Times New Roman"/>
+          <w:bCs/>
+          <w:kern w:val="0"/>
+          <w:lang w:val="en-US"/>
+          <w14:ligatures w14:val="none"/>
+        </w:rPr>
+      </w:pPr>
+      <w:r>
+        <w:rPr>
+          <w:rFonts w:ascii="Times New Roman" w:eastAsia="Times New Roman" w:hAnsi="Times New Roman" w:cs="Times New Roman"/>
+          <w:bCs/>
+          <w:kern w:val="0"/>
+          <w:lang w:val="en-US"/>
+          <w14:ligatures w14:val="none"/>
+        </w:rPr>
+        <w:t>Maintain secure session continuity, account protection, sign-out revocation, and legal-policy acceptance with traceable records.</w:t>
       </w:r>
     </w:p>
     <w:p>
@@ -4393,9 +4431,8 @@
           <w:lang w:val="en-US"/>
           <w14:ligatures w14:val="none"/>
         </w:rPr>
-        <w:t xml:space="preserve">Strengthen </w:t>
-      </w:r>
-      <w:proofErr w:type="gramStart"/>
+        <w:t>Automate personnel operations, including scheduling, attendance, DTR generation, check-</w:t>
+      </w:r>
       <w:r>
         <w:rPr>
           <w:rFonts w:ascii="Times New Roman" w:eastAsia="Times New Roman" w:hAnsi="Times New Roman" w:cs="Times New Roman"/>
@@ -4404,10 +4441,20 @@
           <w:lang w:val="en-US"/>
           <w14:ligatures w14:val="none"/>
         </w:rPr>
-        <w:t>firearm</w:t>
-      </w:r>
-      <w:proofErr w:type="gramEnd"/>
-      <w:r>
+        <w:lastRenderedPageBreak/>
+        <w:t>in/check-out, and replacement coordination.</w:t>
+      </w:r>
+    </w:p>
+    <w:p>
+      <w:pPr>
+        <w:pStyle w:val="ListParagraph"/>
+        <w:widowControl w:val="0"/>
+        <w:numPr>
+          <w:ilvl w:val="1"/>
+          <w:numId w:val="40"/>
+        </w:numPr>
+        <w:spacing w:after="0" w:line="480" w:lineRule="auto"/>
+        <w:jc w:val="both"/>
         <w:rPr>
           <w:rFonts w:ascii="Times New Roman" w:eastAsia="Times New Roman" w:hAnsi="Times New Roman" w:cs="Times New Roman"/>
           <w:bCs/>
@@ -4415,9 +4462,7 @@
           <w:lang w:val="en-US"/>
           <w14:ligatures w14:val="none"/>
         </w:rPr>
-        <w:t xml:space="preserve">, </w:t>
-      </w:r>
-      <w:proofErr w:type="gramStart"/>
+      </w:pPr>
       <w:r>
         <w:rPr>
           <w:rFonts w:ascii="Times New Roman" w:eastAsia="Times New Roman" w:hAnsi="Times New Roman" w:cs="Times New Roman"/>
@@ -4426,10 +4471,19 @@
           <w:lang w:val="en-US"/>
           <w14:ligatures w14:val="none"/>
         </w:rPr>
-        <w:t>permit</w:t>
-      </w:r>
-      <w:proofErr w:type="gramEnd"/>
-      <w:r>
+        <w:t>Maintain guard personnel records, human-readable Guard IDs, schedules, client-site assignments, and personnel availability information.</w:t>
+      </w:r>
+    </w:p>
+    <w:p>
+      <w:pPr>
+        <w:pStyle w:val="ListParagraph"/>
+        <w:widowControl w:val="0"/>
+        <w:numPr>
+          <w:ilvl w:val="1"/>
+          <w:numId w:val="40"/>
+        </w:numPr>
+        <w:spacing w:after="0" w:line="480" w:lineRule="auto"/>
+        <w:jc w:val="both"/>
         <w:rPr>
           <w:rFonts w:ascii="Times New Roman" w:eastAsia="Times New Roman" w:hAnsi="Times New Roman" w:cs="Times New Roman"/>
           <w:bCs/>
@@ -4437,9 +4491,7 @@
           <w:lang w:val="en-US"/>
           <w14:ligatures w14:val="none"/>
         </w:rPr>
-        <w:t xml:space="preserve">, </w:t>
-      </w:r>
-      <w:proofErr w:type="gramStart"/>
+      </w:pPr>
       <w:r>
         <w:rPr>
           <w:rFonts w:ascii="Times New Roman" w:eastAsia="Times New Roman" w:hAnsi="Times New Roman" w:cs="Times New Roman"/>
@@ -4448,10 +4500,19 @@
           <w:lang w:val="en-US"/>
           <w14:ligatures w14:val="none"/>
         </w:rPr>
-        <w:t>vehicle</w:t>
-      </w:r>
-      <w:proofErr w:type="gramEnd"/>
-      <w:r>
+        <w:t>Record attendance, check-in and check-out activities, generate DTR records, and identify schedule conflicts and no-show conditions.</w:t>
+      </w:r>
+    </w:p>
+    <w:p>
+      <w:pPr>
+        <w:pStyle w:val="ListParagraph"/>
+        <w:widowControl w:val="0"/>
+        <w:numPr>
+          <w:ilvl w:val="1"/>
+          <w:numId w:val="40"/>
+        </w:numPr>
+        <w:spacing w:after="0" w:line="480" w:lineRule="auto"/>
+        <w:jc w:val="both"/>
         <w:rPr>
           <w:rFonts w:ascii="Times New Roman" w:eastAsia="Times New Roman" w:hAnsi="Times New Roman" w:cs="Times New Roman"/>
           <w:bCs/>
@@ -4459,7 +4520,16 @@
           <w:lang w:val="en-US"/>
           <w14:ligatures w14:val="none"/>
         </w:rPr>
-        <w:t>, and asset accountability through reports, expiration alerts, issuance tracking, and maintenance monitoring.</w:t>
+      </w:pPr>
+      <w:r>
+        <w:rPr>
+          <w:rFonts w:ascii="Times New Roman" w:eastAsia="Times New Roman" w:hAnsi="Times New Roman" w:cs="Times New Roman"/>
+          <w:bCs/>
+          <w:kern w:val="0"/>
+          <w:lang w:val="en-US"/>
+          <w14:ligatures w14:val="none"/>
+        </w:rPr>
+        <w:t>Support guard replacement coordination through eligible-guard notification, availability checking, ranked replacement recommendations, and confirmed reassignment.</w:t>
       </w:r>
     </w:p>
     <w:p>
@@ -4488,7 +4558,94 @@
           <w:lang w:val="en-US"/>
           <w14:ligatures w14:val="none"/>
         </w:rPr>
-        <w:t>Support field operations through incident reporting, emergency escalation, service requests, notifications, and live monitoring.</w:t>
+        <w:t>Strengthen firearm, permit, vehicle, and asset accountability through reports, expiration alerts, issuance tracking, and maintenance monitoring.</w:t>
+      </w:r>
+    </w:p>
+    <w:p>
+      <w:pPr>
+        <w:pStyle w:val="ListParagraph"/>
+        <w:widowControl w:val="0"/>
+        <w:numPr>
+          <w:ilvl w:val="1"/>
+          <w:numId w:val="40"/>
+        </w:numPr>
+        <w:spacing w:after="0" w:line="480" w:lineRule="auto"/>
+        <w:jc w:val="both"/>
+        <w:rPr>
+          <w:rFonts w:ascii="Times New Roman" w:eastAsia="Times New Roman" w:hAnsi="Times New Roman" w:cs="Times New Roman"/>
+          <w:bCs/>
+          <w:kern w:val="0"/>
+          <w:lang w:val="en-US"/>
+          <w14:ligatures w14:val="none"/>
+        </w:rPr>
+      </w:pPr>
+      <w:r>
+        <w:rPr>
+          <w:rFonts w:ascii="Times New Roman" w:eastAsia="Times New Roman" w:hAnsi="Times New Roman" w:cs="Times New Roman"/>
+          <w:bCs/>
+          <w:kern w:val="0"/>
+          <w:lang w:val="en-US"/>
+          <w14:ligatures w14:val="none"/>
+        </w:rPr>
+        <w:t>Maintain centralized records for firearms, firearm permits, vehicles, driver assignments, trips, and related operational assets.</w:t>
+      </w:r>
+    </w:p>
+    <w:p>
+      <w:pPr>
+        <w:pStyle w:val="ListParagraph"/>
+        <w:widowControl w:val="0"/>
+        <w:numPr>
+          <w:ilvl w:val="1"/>
+          <w:numId w:val="40"/>
+        </w:numPr>
+        <w:spacing w:after="0" w:line="480" w:lineRule="auto"/>
+        <w:jc w:val="both"/>
+        <w:rPr>
+          <w:rFonts w:ascii="Times New Roman" w:eastAsia="Times New Roman" w:hAnsi="Times New Roman" w:cs="Times New Roman"/>
+          <w:bCs/>
+          <w:kern w:val="0"/>
+          <w:lang w:val="en-US"/>
+          <w14:ligatures w14:val="none"/>
+        </w:rPr>
+      </w:pPr>
+      <w:r>
+        <w:rPr>
+          <w:rFonts w:ascii="Times New Roman" w:eastAsia="Times New Roman" w:hAnsi="Times New Roman" w:cs="Times New Roman"/>
+          <w:bCs/>
+          <w:kern w:val="0"/>
+          <w:lang w:val="en-US"/>
+          <w14:ligatures w14:val="none"/>
+        </w:rPr>
+        <w:t>Track firearm issuance, custody, return, permit validity, applicable training requirements, and asset availability.</w:t>
+      </w:r>
+    </w:p>
+    <w:p>
+      <w:pPr>
+        <w:pStyle w:val="ListParagraph"/>
+        <w:widowControl w:val="0"/>
+        <w:numPr>
+          <w:ilvl w:val="1"/>
+          <w:numId w:val="40"/>
+        </w:numPr>
+        <w:spacing w:after="0" w:line="480" w:lineRule="auto"/>
+        <w:jc w:val="both"/>
+        <w:rPr>
+          <w:rFonts w:ascii="Times New Roman" w:eastAsia="Times New Roman" w:hAnsi="Times New Roman" w:cs="Times New Roman"/>
+          <w:bCs/>
+          <w:kern w:val="0"/>
+          <w:lang w:val="en-US"/>
+          <w14:ligatures w14:val="none"/>
+        </w:rPr>
+      </w:pPr>
+      <w:r>
+        <w:rPr>
+          <w:rFonts w:ascii="Times New Roman" w:eastAsia="Times New Roman" w:hAnsi="Times New Roman" w:cs="Times New Roman"/>
+          <w:bCs/>
+          <w:kern w:val="0"/>
+          <w:lang w:val="en-US"/>
+          <w14:ligatures w14:val="none"/>
+        </w:rPr>
+        <w:t>Monitor permit expirations, vehicle and firearm maintenance activities, asset status, and accountability records through alerts and operational reports.</w:t>
       </w:r>
     </w:p>
     <w:p>
@@ -4517,7 +4674,94 @@
           <w:lang w:val="en-US"/>
           <w14:ligatures w14:val="none"/>
         </w:rPr>
-        <w:t>Provide performance evaluation and analytics through graphical reports on attendance, punctuality, incidents, assignments, and guard performance.</w:t>
+        <w:t>Support field operations through incident reporting, emergency escalation, service requests, notifications, and live monitoring.</w:t>
+      </w:r>
+    </w:p>
+    <w:p>
+      <w:pPr>
+        <w:pStyle w:val="ListParagraph"/>
+        <w:widowControl w:val="0"/>
+        <w:numPr>
+          <w:ilvl w:val="1"/>
+          <w:numId w:val="40"/>
+        </w:numPr>
+        <w:spacing w:after="0" w:line="480" w:lineRule="auto"/>
+        <w:jc w:val="both"/>
+        <w:rPr>
+          <w:rFonts w:ascii="Times New Roman" w:eastAsia="Times New Roman" w:hAnsi="Times New Roman" w:cs="Times New Roman"/>
+          <w:bCs/>
+          <w:kern w:val="0"/>
+          <w:lang w:val="en-US"/>
+          <w14:ligatures w14:val="none"/>
+        </w:rPr>
+      </w:pPr>
+      <w:r>
+        <w:rPr>
+          <w:rFonts w:ascii="Times New Roman" w:eastAsia="Times New Roman" w:hAnsi="Times New Roman" w:cs="Times New Roman"/>
+          <w:bCs/>
+          <w:kern w:val="0"/>
+          <w:lang w:val="en-US"/>
+          <w14:ligatures w14:val="none"/>
+        </w:rPr>
+        <w:t>Enable guards and authorized users to submit incident reports, support requests, emergency alerts, and panic escalations.</w:t>
+      </w:r>
+    </w:p>
+    <w:p>
+      <w:pPr>
+        <w:pStyle w:val="ListParagraph"/>
+        <w:widowControl w:val="0"/>
+        <w:numPr>
+          <w:ilvl w:val="1"/>
+          <w:numId w:val="40"/>
+        </w:numPr>
+        <w:spacing w:after="0" w:line="480" w:lineRule="auto"/>
+        <w:jc w:val="both"/>
+        <w:rPr>
+          <w:rFonts w:ascii="Times New Roman" w:eastAsia="Times New Roman" w:hAnsi="Times New Roman" w:cs="Times New Roman"/>
+          <w:bCs/>
+          <w:kern w:val="0"/>
+          <w:lang w:val="en-US"/>
+          <w14:ligatures w14:val="none"/>
+        </w:rPr>
+      </w:pPr>
+      <w:r>
+        <w:rPr>
+          <w:rFonts w:ascii="Times New Roman" w:eastAsia="Times New Roman" w:hAnsi="Times New Roman" w:cs="Times New Roman"/>
+          <w:bCs/>
+          <w:kern w:val="0"/>
+          <w:lang w:val="en-US"/>
+          <w14:ligatures w14:val="none"/>
+        </w:rPr>
+        <w:t>Provide near-real-time operational visibility through location tracking, movement history, client-site information, geofence monitoring, and operations-map views.</w:t>
+      </w:r>
+    </w:p>
+    <w:p>
+      <w:pPr>
+        <w:pStyle w:val="ListParagraph"/>
+        <w:widowControl w:val="0"/>
+        <w:numPr>
+          <w:ilvl w:val="1"/>
+          <w:numId w:val="40"/>
+        </w:numPr>
+        <w:spacing w:after="0" w:line="480" w:lineRule="auto"/>
+        <w:jc w:val="both"/>
+        <w:rPr>
+          <w:rFonts w:ascii="Times New Roman" w:eastAsia="Times New Roman" w:hAnsi="Times New Roman" w:cs="Times New Roman"/>
+          <w:bCs/>
+          <w:kern w:val="0"/>
+          <w:lang w:val="en-US"/>
+          <w14:ligatures w14:val="none"/>
+        </w:rPr>
+      </w:pPr>
+      <w:r>
+        <w:rPr>
+          <w:rFonts w:ascii="Times New Roman" w:eastAsia="Times New Roman" w:hAnsi="Times New Roman" w:cs="Times New Roman"/>
+          <w:bCs/>
+          <w:kern w:val="0"/>
+          <w:lang w:val="en-US"/>
+          <w14:ligatures w14:val="none"/>
+        </w:rPr>
+        <w:t>Deliver role-appropriate notifications, Inbox workflows, mission information, and selected offline support for priority field actions.</w:t>
       </w:r>
     </w:p>
     <w:p>
@@ -4546,7 +4790,7 @@
           <w:lang w:val="en-US"/>
           <w14:ligatures w14:val="none"/>
         </w:rPr>
-        <w:t xml:space="preserve">Deliver a traceable multi-platform system for Web, Desktop, and Android with audit </w:t>
+        <w:t xml:space="preserve">Provide performance evaluation and analytics through graphical reports on attendance, </w:t>
       </w:r>
       <w:r>
         <w:rPr>
@@ -4557,12 +4801,17 @@
           <w14:ligatures w14:val="none"/>
         </w:rPr>
         <w:lastRenderedPageBreak/>
-        <w:t>logs, approval workflows, and operational reports.</w:t>
-      </w:r>
-    </w:p>
-    <w:p>
-      <w:pPr>
+        <w:t>punctuality, incidents, assignments, and guard performance.</w:t>
+      </w:r>
+    </w:p>
+    <w:p>
+      <w:pPr>
+        <w:pStyle w:val="ListParagraph"/>
         <w:widowControl w:val="0"/>
+        <w:numPr>
+          <w:ilvl w:val="1"/>
+          <w:numId w:val="40"/>
+        </w:numPr>
         <w:spacing w:after="0" w:line="480" w:lineRule="auto"/>
         <w:jc w:val="both"/>
         <w:rPr>
@@ -4573,6 +4822,190 @@
           <w14:ligatures w14:val="none"/>
         </w:rPr>
       </w:pPr>
+      <w:r>
+        <w:rPr>
+          <w:rFonts w:ascii="Times New Roman" w:eastAsia="Times New Roman" w:hAnsi="Times New Roman" w:cs="Times New Roman"/>
+          <w:bCs/>
+          <w:kern w:val="0"/>
+          <w:lang w:val="en-US"/>
+          <w14:ligatures w14:val="none"/>
+        </w:rPr>
+        <w:t>Generate graphical reports and operational summaries covering attendance, punctuality, incidents, assignments, and guard-performance indicators.</w:t>
+      </w:r>
+    </w:p>
+    <w:p>
+      <w:pPr>
+        <w:pStyle w:val="ListParagraph"/>
+        <w:widowControl w:val="0"/>
+        <w:numPr>
+          <w:ilvl w:val="1"/>
+          <w:numId w:val="40"/>
+        </w:numPr>
+        <w:spacing w:after="0" w:line="480" w:lineRule="auto"/>
+        <w:jc w:val="both"/>
+        <w:rPr>
+          <w:rFonts w:ascii="Times New Roman" w:eastAsia="Times New Roman" w:hAnsi="Times New Roman" w:cs="Times New Roman"/>
+          <w:bCs/>
+          <w:kern w:val="0"/>
+          <w:lang w:val="en-US"/>
+          <w14:ligatures w14:val="none"/>
+        </w:rPr>
+      </w:pPr>
+      <w:r>
+        <w:rPr>
+          <w:rFonts w:ascii="Times New Roman" w:eastAsia="Times New Roman" w:hAnsi="Times New Roman" w:cs="Times New Roman"/>
+          <w:bCs/>
+          <w:kern w:val="0"/>
+          <w:lang w:val="en-US"/>
+          <w14:ligatures w14:val="none"/>
+        </w:rPr>
+        <w:t>Apply rule-based scoring and analytical methods to support merit evaluation, risk identification, replacement recommendations, and operational alerts.</w:t>
+      </w:r>
+    </w:p>
+    <w:p>
+      <w:pPr>
+        <w:pStyle w:val="ListParagraph"/>
+        <w:widowControl w:val="0"/>
+        <w:numPr>
+          <w:ilvl w:val="1"/>
+          <w:numId w:val="40"/>
+        </w:numPr>
+        <w:spacing w:after="0" w:line="480" w:lineRule="auto"/>
+        <w:jc w:val="both"/>
+        <w:rPr>
+          <w:rFonts w:ascii="Times New Roman" w:eastAsia="Times New Roman" w:hAnsi="Times New Roman" w:cs="Times New Roman"/>
+          <w:bCs/>
+          <w:kern w:val="0"/>
+          <w:lang w:val="en-US"/>
+          <w14:ligatures w14:val="none"/>
+        </w:rPr>
+      </w:pPr>
+      <w:r>
+        <w:rPr>
+          <w:rFonts w:ascii="Times New Roman" w:eastAsia="Times New Roman" w:hAnsi="Times New Roman" w:cs="Times New Roman"/>
+          <w:bCs/>
+          <w:kern w:val="0"/>
+          <w:lang w:val="en-US"/>
+          <w14:ligatures w14:val="none"/>
+        </w:rPr>
+        <w:t>Provide authorized command users with dashboards and filtered analytical information for personnel evaluation and operational decision-making.</w:t>
+      </w:r>
+    </w:p>
+    <w:p>
+      <w:pPr>
+        <w:pStyle w:val="ListParagraph"/>
+        <w:widowControl w:val="0"/>
+        <w:numPr>
+          <w:ilvl w:val="0"/>
+          <w:numId w:val="40"/>
+        </w:numPr>
+        <w:spacing w:after="0" w:line="480" w:lineRule="auto"/>
+        <w:jc w:val="both"/>
+        <w:rPr>
+          <w:rFonts w:ascii="Times New Roman" w:eastAsia="Times New Roman" w:hAnsi="Times New Roman" w:cs="Times New Roman"/>
+          <w:bCs/>
+          <w:kern w:val="0"/>
+          <w:lang w:val="en-US"/>
+          <w14:ligatures w14:val="none"/>
+        </w:rPr>
+      </w:pPr>
+      <w:r>
+        <w:rPr>
+          <w:rFonts w:ascii="Times New Roman" w:eastAsia="Times New Roman" w:hAnsi="Times New Roman" w:cs="Times New Roman"/>
+          <w:bCs/>
+          <w:kern w:val="0"/>
+          <w:lang w:val="en-US"/>
+          <w14:ligatures w14:val="none"/>
+        </w:rPr>
+        <w:t>Deliver a traceable security operations system with an implemented Web application and configured Windows desktop and Android deployment targets, supported by audit logs, approval workflows, and operational reports.</w:t>
+      </w:r>
+    </w:p>
+    <w:p>
+      <w:pPr>
+        <w:pStyle w:val="ListParagraph"/>
+        <w:widowControl w:val="0"/>
+        <w:numPr>
+          <w:ilvl w:val="1"/>
+          <w:numId w:val="40"/>
+        </w:numPr>
+        <w:spacing w:after="0" w:line="480" w:lineRule="auto"/>
+        <w:jc w:val="both"/>
+        <w:rPr>
+          <w:rFonts w:ascii="Times New Roman" w:eastAsia="Times New Roman" w:hAnsi="Times New Roman" w:cs="Times New Roman"/>
+          <w:bCs/>
+          <w:kern w:val="0"/>
+          <w:lang w:val="en-US"/>
+          <w14:ligatures w14:val="none"/>
+        </w:rPr>
+      </w:pPr>
+      <w:r>
+        <w:rPr>
+          <w:rFonts w:ascii="Times New Roman" w:eastAsia="Times New Roman" w:hAnsi="Times New Roman" w:cs="Times New Roman"/>
+          <w:bCs/>
+          <w:kern w:val="0"/>
+          <w:lang w:val="en-US"/>
+          <w14:ligatures w14:val="none"/>
+        </w:rPr>
+        <w:t>Provide role-governed access to SENTINEL through Web, Windows desktop, and Android applications using shared application services and centralized operational data.</w:t>
+      </w:r>
+    </w:p>
+    <w:p>
+      <w:pPr>
+        <w:pStyle w:val="ListParagraph"/>
+        <w:widowControl w:val="0"/>
+        <w:numPr>
+          <w:ilvl w:val="1"/>
+          <w:numId w:val="40"/>
+        </w:numPr>
+        <w:spacing w:after="0" w:line="480" w:lineRule="auto"/>
+        <w:jc w:val="both"/>
+        <w:rPr>
+          <w:rFonts w:ascii="Times New Roman" w:eastAsia="Times New Roman" w:hAnsi="Times New Roman" w:cs="Times New Roman"/>
+          <w:bCs/>
+          <w:kern w:val="0"/>
+          <w:lang w:val="en-US"/>
+          <w14:ligatures w14:val="none"/>
+        </w:rPr>
+      </w:pPr>
+      <w:r>
+        <w:rPr>
+          <w:rFonts w:ascii="Times New Roman" w:eastAsia="Times New Roman" w:hAnsi="Times New Roman" w:cs="Times New Roman"/>
+          <w:bCs/>
+          <w:kern w:val="0"/>
+          <w:lang w:val="en-US"/>
+          <w14:ligatures w14:val="none"/>
+        </w:rPr>
+        <w:t>Maintain audit logs, approval histories, security events, and user-action records to support accountability and forensic review.</w:t>
+      </w:r>
+    </w:p>
+    <w:p>
+      <w:pPr>
+        <w:pStyle w:val="ListParagraph"/>
+        <w:widowControl w:val="0"/>
+        <w:numPr>
+          <w:ilvl w:val="1"/>
+          <w:numId w:val="40"/>
+        </w:numPr>
+        <w:spacing w:after="0" w:line="480" w:lineRule="auto"/>
+        <w:jc w:val="both"/>
+        <w:rPr>
+          <w:rFonts w:ascii="Times New Roman" w:eastAsia="Times New Roman" w:hAnsi="Times New Roman" w:cs="Times New Roman"/>
+          <w:bCs/>
+          <w:kern w:val="0"/>
+          <w:lang w:val="en-US"/>
+          <w14:ligatures w14:val="none"/>
+        </w:rPr>
+      </w:pPr>
+      <w:r>
+        <w:rPr>
+          <w:rFonts w:ascii="Times New Roman" w:eastAsia="Times New Roman" w:hAnsi="Times New Roman" w:cs="Times New Roman"/>
+          <w:bCs/>
+          <w:kern w:val="0"/>
+          <w:lang w:val="en-US"/>
+          <w14:ligatures w14:val="none"/>
+        </w:rPr>
+        <w:t>Generate traceable operational reports and maintain system records that support governance, compliance review, and institutional monitoring.</w:t>
+      </w:r>
     </w:p>
     <w:p>
       <w:pPr>
@@ -4651,7 +5084,17 @@
           <w:kern w:val="0"/>
           <w14:ligatures w14:val="none"/>
         </w:rPr>
-        <w:t>The SENTINEL system covers the implemented operational, compliance, and governance requirements of a private security agency within the regulatory context of Republic Act No. 11917 (2022). The scope includes role-governed command and field workflows, centralized operational records, quick-action coordination surfaces, real-time situational monitoring, decision-support outputs, forensic audit visibility, and cross-platform delivery across Web, Desktop, and Android environments.</w:t>
+        <w:t xml:space="preserve">The SENTINEL system covers the implemented operational, compliance, and governance requirements of a private security agency within the regulatory context of Republic Act No. 11917 (2022). The scope includes role-governed command and field workflows, centralized operational records, quick-action coordination surfaces, near-real-time situational monitoring, decision-support outputs, and forensic audit visibility. The Web application is the implemented primary runtime. Windows desktop packaging </w:t>
+      </w:r>
+      <w:r>
+        <w:rPr>
+          <w:rFonts w:ascii="Times New Roman" w:eastAsia="Times New Roman" w:hAnsi="Times New Roman" w:cs="Times New Roman"/>
+          <w:bCs/>
+          <w:kern w:val="0"/>
+          <w14:ligatures w14:val="none"/>
+        </w:rPr>
+        <w:lastRenderedPageBreak/>
+        <w:t>through Tauri and Android packaging through Capacitor are configured deployment targets; packaged and signed runtime validation remains required before full platform parity can be established.</w:t>
       </w:r>
     </w:p>
     <w:p>
@@ -4703,7 +5146,7 @@
           <w:kern w:val="0"/>
           <w14:ligatures w14:val="none"/>
         </w:rPr>
-        <w:t>Personnel profiles, role and approval data, licensing and permit records, schedules, attendance logs, availability status, merit indicators, and legal-consent records.</w:t>
+        <w:t>Personnel profiles, human-readable Guard IDs, role and approval data, licensing and permit records, schedules, attendance logs, availability status, merit indicators, and legal-consent records.</w:t>
       </w:r>
     </w:p>
     <w:p>
@@ -4884,7 +5327,6 @@
           <w:kern w:val="0"/>
           <w14:ligatures w14:val="none"/>
         </w:rPr>
-        <w:lastRenderedPageBreak/>
         <w:t>Release and service-health records required for runtime governance and operational monitoring.</w:t>
       </w:r>
     </w:p>
@@ -4991,6 +5433,7 @@
           <w:kern w:val="0"/>
           <w14:ligatures w14:val="none"/>
         </w:rPr>
+        <w:lastRenderedPageBreak/>
         <w:t>Role-based dashboards for command monitoring, approvals, analytics, scheduling, audit review, and profile management.</w:t>
       </w:r>
     </w:p>
@@ -5207,7 +5650,6 @@
           <w:kern w:val="0"/>
           <w14:ligatures w14:val="none"/>
         </w:rPr>
-        <w:lastRenderedPageBreak/>
         <w:t>Guard movement reconstruction, including active roster monitoring, historical trail replay, patrol reconstruction, and geofence escalation.</w:t>
       </w:r>
     </w:p>
@@ -5290,7 +5732,17 @@
           <w:kern w:val="0"/>
           <w14:ligatures w14:val="none"/>
         </w:rPr>
-        <w:t>Legal confirmation workflows, including policy review, mandatory acceptance capture, and access gating until accepted.</w:t>
+        <w:t xml:space="preserve">Legal confirmation workflows, including policy review, mandatory </w:t>
+      </w:r>
+      <w:r>
+        <w:rPr>
+          <w:rFonts w:ascii="Times New Roman" w:eastAsia="Times New Roman" w:hAnsi="Times New Roman" w:cs="Times New Roman"/>
+          <w:bCs/>
+          <w:kern w:val="0"/>
+          <w14:ligatures w14:val="none"/>
+        </w:rPr>
+        <w:lastRenderedPageBreak/>
+        <w:t>acceptance capture, and access gating until accepted.</w:t>
       </w:r>
     </w:p>
     <w:p>
@@ -5420,7 +5872,7 @@
           <w:kern w:val="0"/>
           <w14:ligatures w14:val="none"/>
         </w:rPr>
-        <w:t>Cross-platform runtime deployment for Web, Desktop (Tauri), and Mobile Android (Capacitor).</w:t>
+        <w:t>Configured Windows desktop packaging through Tauri and Android packaging through Capacitor as additional deployment targets, subject to packaged-release validation.</w:t>
       </w:r>
     </w:p>
     <w:p>
@@ -5519,126 +5971,6 @@
           <w14:ligatures w14:val="none"/>
         </w:rPr>
       </w:pPr>
-    </w:p>
-    <w:p>
-      <w:pPr>
-        <w:widowControl w:val="0"/>
-        <w:spacing w:after="0" w:line="480" w:lineRule="auto"/>
-        <w:ind w:left="440"/>
-        <w:jc w:val="both"/>
-        <w:rPr>
-          <w:rFonts w:ascii="Times New Roman" w:eastAsia="Times New Roman" w:hAnsi="Times New Roman" w:cs="Times New Roman"/>
-          <w:b/>
-          <w:kern w:val="0"/>
-          <w:lang w:val="en-US"/>
-          <w14:ligatures w14:val="none"/>
-        </w:rPr>
-      </w:pPr>
-    </w:p>
-    <w:p>
-      <w:pPr>
-        <w:widowControl w:val="0"/>
-        <w:spacing w:after="0" w:line="480" w:lineRule="auto"/>
-        <w:ind w:left="440"/>
-        <w:jc w:val="both"/>
-        <w:rPr>
-          <w:rFonts w:ascii="Times New Roman" w:eastAsia="Times New Roman" w:hAnsi="Times New Roman" w:cs="Times New Roman"/>
-          <w:b/>
-          <w:kern w:val="0"/>
-          <w:lang w:val="en-US"/>
-          <w14:ligatures w14:val="none"/>
-        </w:rPr>
-      </w:pPr>
-    </w:p>
-    <w:p>
-      <w:pPr>
-        <w:widowControl w:val="0"/>
-        <w:spacing w:after="0" w:line="480" w:lineRule="auto"/>
-        <w:ind w:left="440"/>
-        <w:jc w:val="both"/>
-        <w:rPr>
-          <w:rFonts w:ascii="Times New Roman" w:eastAsia="Times New Roman" w:hAnsi="Times New Roman" w:cs="Times New Roman"/>
-          <w:b/>
-          <w:kern w:val="0"/>
-          <w:lang w:val="en-US"/>
-          <w14:ligatures w14:val="none"/>
-        </w:rPr>
-      </w:pPr>
-    </w:p>
-    <w:p>
-      <w:pPr>
-        <w:widowControl w:val="0"/>
-        <w:spacing w:after="0" w:line="480" w:lineRule="auto"/>
-        <w:ind w:left="440"/>
-        <w:jc w:val="both"/>
-        <w:rPr>
-          <w:rFonts w:ascii="Times New Roman" w:eastAsia="Times New Roman" w:hAnsi="Times New Roman" w:cs="Times New Roman"/>
-          <w:b/>
-          <w:kern w:val="0"/>
-          <w:lang w:val="en-US"/>
-          <w14:ligatures w14:val="none"/>
-        </w:rPr>
-      </w:pPr>
-    </w:p>
-    <w:p>
-      <w:pPr>
-        <w:widowControl w:val="0"/>
-        <w:spacing w:after="0" w:line="480" w:lineRule="auto"/>
-        <w:ind w:left="440"/>
-        <w:jc w:val="both"/>
-        <w:rPr>
-          <w:rFonts w:ascii="Times New Roman" w:eastAsia="Times New Roman" w:hAnsi="Times New Roman" w:cs="Times New Roman"/>
-          <w:b/>
-          <w:kern w:val="0"/>
-          <w:lang w:val="en-US"/>
-          <w14:ligatures w14:val="none"/>
-        </w:rPr>
-      </w:pPr>
-    </w:p>
-    <w:p>
-      <w:pPr>
-        <w:widowControl w:val="0"/>
-        <w:spacing w:after="0" w:line="480" w:lineRule="auto"/>
-        <w:ind w:left="440"/>
-        <w:jc w:val="both"/>
-        <w:rPr>
-          <w:rFonts w:ascii="Times New Roman" w:eastAsia="Times New Roman" w:hAnsi="Times New Roman" w:cs="Times New Roman"/>
-          <w:b/>
-          <w:kern w:val="0"/>
-          <w:lang w:val="en-US"/>
-          <w14:ligatures w14:val="none"/>
-        </w:rPr>
-      </w:pPr>
-    </w:p>
-    <w:p>
-      <w:pPr>
-        <w:widowControl w:val="0"/>
-        <w:spacing w:after="0" w:line="480" w:lineRule="auto"/>
-        <w:ind w:left="440"/>
-        <w:jc w:val="both"/>
-        <w:rPr>
-          <w:rFonts w:ascii="Times New Roman" w:eastAsia="Times New Roman" w:hAnsi="Times New Roman" w:cs="Times New Roman"/>
-          <w:b/>
-          <w:kern w:val="0"/>
-          <w:lang w:val="en-US"/>
-          <w14:ligatures w14:val="none"/>
-        </w:rPr>
-      </w:pPr>
-    </w:p>
-    <w:p>
-      <w:pPr>
-        <w:widowControl w:val="0"/>
-        <w:spacing w:after="0" w:line="480" w:lineRule="auto"/>
-        <w:ind w:left="440"/>
-        <w:jc w:val="both"/>
-        <w:rPr>
-          <w:rFonts w:ascii="Times New Roman" w:eastAsia="Times New Roman" w:hAnsi="Times New Roman" w:cs="Times New Roman"/>
-          <w:b/>
-          <w:kern w:val="0"/>
-          <w:lang w:val="en-US"/>
-          <w14:ligatures w14:val="none"/>
-        </w:rPr>
-      </w:pPr>
       <w:r>
         <w:rPr>
           <w:rFonts w:ascii="Times New Roman" w:eastAsia="Times New Roman" w:hAnsi="Times New Roman" w:cs="Times New Roman"/>
@@ -5700,7 +6032,16 @@
           <w:kern w:val="0"/>
           <w14:ligatures w14:val="none"/>
         </w:rPr>
-        <w:t>) implementation constraints, wherein certain backend-supported capabilities, such as direct training-record administration and full geofence-zone administration, are not yet fully exposed through complete end-user command surfaces, while some workflows remain consolidated within shared dashboard panels, tabs, and shell overlays rather than being deployed as fully independent standalone modules.</w:t>
+        <w:t>) implementation constraints, wherein certain backend-</w:t>
+      </w:r>
+      <w:r>
+        <w:rPr>
+          <w:rFonts w:ascii="Times New Roman" w:eastAsia="Times New Roman" w:hAnsi="Times New Roman" w:cs="Times New Roman"/>
+          <w:kern w:val="0"/>
+          <w14:ligatures w14:val="none"/>
+        </w:rPr>
+        <w:lastRenderedPageBreak/>
+        <w:t>supported capabilities, such as direct training-record administration and full geofence-zone administration, are not yet fully exposed through complete end-user command surfaces, while some workflows remain consolidated within shared dashboard panels, tabs, and shell overlays rather than being deployed as fully independent standalone modules.</w:t>
       </w:r>
     </w:p>
     <w:p>
@@ -5789,40 +6130,28 @@
     </w:p>
     <w:p>
       <w:pPr>
-        <w:pStyle w:val="TNRHeading2"/>
-        <w:ind w:left="0"/>
-      </w:pPr>
-      <w:bookmarkStart w:id="14" w:name="_Toc230160660"/>
-      <w:r>
-        <w:lastRenderedPageBreak/>
-        <w:t>Review of Related Literature/Studies/Systems</w:t>
-      </w:r>
-      <w:bookmarkEnd w:id="14"/>
-    </w:p>
-    <w:p>
-      <w:pPr>
         <w:widowControl w:val="0"/>
         <w:spacing w:after="0" w:line="480" w:lineRule="auto"/>
         <w:ind w:right="126"/>
         <w:jc w:val="both"/>
         <w:rPr>
           <w:rFonts w:ascii="Times New Roman" w:eastAsia="Times New Roman" w:hAnsi="Times New Roman" w:cs="Times New Roman"/>
-          <w:b/>
-          <w:bCs/>
-          <w:kern w:val="0"/>
-          <w14:ligatures w14:val="none"/>
-        </w:rPr>
-      </w:pPr>
-      <w:r>
-        <w:rPr>
-          <w:rFonts w:ascii="Times New Roman" w:eastAsia="Times New Roman" w:hAnsi="Times New Roman" w:cs="Times New Roman"/>
-          <w:b/>
-          <w:bCs/>
-          <w:kern w:val="0"/>
-          <w14:ligatures w14:val="none"/>
-        </w:rPr>
-        <w:t>Related Literature</w:t>
-      </w:r>
+          <w:kern w:val="0"/>
+          <w:lang w:val="en-US"/>
+          <w14:ligatures w14:val="none"/>
+        </w:rPr>
+      </w:pPr>
+    </w:p>
+    <w:p>
+      <w:pPr>
+        <w:pStyle w:val="TNRHeading2"/>
+        <w:ind w:left="0"/>
+      </w:pPr>
+      <w:bookmarkStart w:id="14" w:name="_Toc230160660"/>
+      <w:r>
+        <w:t>Review of Related Literature/Studies/Systems</w:t>
+      </w:r>
+      <w:bookmarkEnd w:id="14"/>
     </w:p>
     <w:p>
       <w:pPr>
@@ -5832,6 +6161,31 @@
         <w:jc w:val="both"/>
         <w:rPr>
           <w:rFonts w:ascii="Times New Roman" w:eastAsia="Times New Roman" w:hAnsi="Times New Roman" w:cs="Times New Roman"/>
+          <w:b/>
+          <w:bCs/>
+          <w:kern w:val="0"/>
+          <w14:ligatures w14:val="none"/>
+        </w:rPr>
+      </w:pPr>
+      <w:r>
+        <w:rPr>
+          <w:rFonts w:ascii="Times New Roman" w:eastAsia="Times New Roman" w:hAnsi="Times New Roman" w:cs="Times New Roman"/>
+          <w:b/>
+          <w:bCs/>
+          <w:kern w:val="0"/>
+          <w14:ligatures w14:val="none"/>
+        </w:rPr>
+        <w:t>Related Literature</w:t>
+      </w:r>
+    </w:p>
+    <w:p>
+      <w:pPr>
+        <w:widowControl w:val="0"/>
+        <w:spacing w:after="0" w:line="480" w:lineRule="auto"/>
+        <w:ind w:right="126"/>
+        <w:jc w:val="both"/>
+        <w:rPr>
+          <w:rFonts w:ascii="Times New Roman" w:eastAsia="Times New Roman" w:hAnsi="Times New Roman" w:cs="Times New Roman"/>
           <w:kern w:val="0"/>
           <w14:ligatures w14:val="none"/>
         </w:rPr>
@@ -5850,43 +6204,7 @@
           <w:kern w:val="0"/>
           <w14:ligatures w14:val="none"/>
         </w:rPr>
-        <w:t xml:space="preserve">The Philippine private security sector is currently navigating its most significant legal transition in over fifty years. The enactment of the Private Security Services Industry Act (Republic Act No. 11917, 2022) effectively repealed the outdated RA 5487, shifting the industry toward a regime of "Professionalized Accountability." According to Jur.ph (2025), the law’s Implementing Rules and Regulations (IRR) mandate that Private Security Agencies (PSAs) maintain highly accurate, digitized records of License to Exercise Security Profession (LESP) and firearm </w:t>
-      </w:r>
-      <w:proofErr w:type="gramStart"/>
-      <w:r>
-        <w:rPr>
-          <w:rFonts w:ascii="Times New Roman" w:eastAsia="Times New Roman" w:hAnsi="Times New Roman" w:cs="Times New Roman"/>
-          <w:kern w:val="0"/>
-          <w14:ligatures w14:val="none"/>
-        </w:rPr>
-        <w:t>permits</w:t>
-      </w:r>
-      <w:proofErr w:type="gramEnd"/>
-      <w:r>
-        <w:rPr>
-          <w:rFonts w:ascii="Times New Roman" w:eastAsia="Times New Roman" w:hAnsi="Times New Roman" w:cs="Times New Roman"/>
-          <w:kern w:val="0"/>
-          <w14:ligatures w14:val="none"/>
-        </w:rPr>
-        <w:t xml:space="preserve">. The act introduces a "strict liability" framework </w:t>
-      </w:r>
-      <w:proofErr w:type="gramStart"/>
-      <w:r>
-        <w:rPr>
-          <w:rFonts w:ascii="Times New Roman" w:eastAsia="Times New Roman" w:hAnsi="Times New Roman" w:cs="Times New Roman"/>
-          <w:kern w:val="0"/>
-          <w14:ligatures w14:val="none"/>
-        </w:rPr>
-        <w:t>where</w:t>
-      </w:r>
-      <w:proofErr w:type="gramEnd"/>
-      <w:r>
-        <w:rPr>
-          <w:rFonts w:ascii="Times New Roman" w:eastAsia="Times New Roman" w:hAnsi="Times New Roman" w:cs="Times New Roman"/>
-          <w:kern w:val="0"/>
-          <w14:ligatures w14:val="none"/>
-        </w:rPr>
-        <w:t xml:space="preserve"> administrative negligence</w:t>
+        <w:t>The Philippine private security sector is currently navigating its most significant legal transition in over fifty years. The enactment of the Private Security Services Industry Act (Republic Act No. 11917, 2022) effectively repealed the outdated RA 5487, shifting the industry toward a regime of "Professionalized Accountability." According to Jur.ph (2025), the law’s Implementing Rules and Regulations (IRR) mandate that Private Security Agencies (PSAs) maintain highly accurate, digitized records of License to Exercise Security Profession (LESP) and firearm permits. The act introduces a "strict liability" framework where administrative negligence</w:t>
       </w:r>
       <w:r>
         <w:rPr>
@@ -5939,7 +6257,16 @@
           <w:kern w:val="0"/>
           <w14:ligatures w14:val="none"/>
         </w:rPr>
-        <w:t>This regulatory pressure has necessitated a move toward Automated Regulatory Compliance Tracking (ARCT). Research by Khinvasara, T., Shankar, A., &amp; Wong, C. (2024) suggests that for organizations managing complex, shifting rules, the use of automated monitoring is a "significant advancement" that eliminates the "discovery lag" inherent in manual audits. By leveraging system-driven triggers for license expirations, PSAs can transition from reactive compliance to a proactive stance, ensuring that no personnel or asset is deployed without valid legal authorization.</w:t>
+        <w:t xml:space="preserve">This regulatory pressure has necessitated a move toward Automated Regulatory Compliance Tracking (ARCT). Research by Khinvasara, T., Shankar, A., &amp; Wong, C. (2024) </w:t>
+      </w:r>
+      <w:r>
+        <w:rPr>
+          <w:rFonts w:ascii="Times New Roman" w:eastAsia="Times New Roman" w:hAnsi="Times New Roman" w:cs="Times New Roman"/>
+          <w:kern w:val="0"/>
+          <w14:ligatures w14:val="none"/>
+        </w:rPr>
+        <w:lastRenderedPageBreak/>
+        <w:t>suggests that for organizations managing complex, shifting rules, the use of automated monitoring is a "significant advancement" that eliminates the "discovery lag" inherent in manual audits. By leveraging system-driven triggers for license expirations, PSAs can transition from reactive compliance to a proactive stance, ensuring that no personnel or asset is deployed without valid legal authorization.</w:t>
       </w:r>
     </w:p>
     <w:p>
@@ -6013,7 +6340,6 @@
           <w:kern w:val="0"/>
           <w14:ligatures w14:val="none"/>
         </w:rPr>
-        <w:lastRenderedPageBreak/>
         <w:t xml:space="preserve">Modern systems mitigate this by automating the identification and deployment of replacements based on real-time availability, shifting the organizational stance from reactive crisis management to proactive risk mitigation (Al-Khafajiy et al., 2022). Furthermore, </w:t>
       </w:r>
       <w:r>
@@ -6120,7 +6446,16 @@
           <w:kern w:val="0"/>
           <w14:ligatures w14:val="none"/>
         </w:rPr>
-        <w:t>For security agencies like DASIA Tagum, implementing centralized performance metrics</w:t>
+        <w:t xml:space="preserve">For security agencies like DASIA Tagum, implementing centralized performance </w:t>
+      </w:r>
+      <w:r>
+        <w:rPr>
+          <w:rFonts w:ascii="Times New Roman" w:eastAsia="Times New Roman" w:hAnsi="Times New Roman" w:cs="Times New Roman"/>
+          <w:kern w:val="0"/>
+          <w14:ligatures w14:val="none"/>
+        </w:rPr>
+        <w:lastRenderedPageBreak/>
+        <w:t>metrics</w:t>
       </w:r>
       <w:r>
         <w:rPr>
@@ -6173,16 +6508,7 @@
           <w:kern w:val="0"/>
           <w14:ligatures w14:val="none"/>
         </w:rPr>
-        <w:t xml:space="preserve">The systematic allocation of firearms is a matter of both Chain of Custody (CoC) and legal necessity under the Private Security Services Industry Act (Republic Act No. 11917, 2022). The law mandates strict accountability for firearms, requiring that only authorized, trained, and compliant guards carry weapons. Manual processes often suffer from "data drift," where the status of a weapon and the permit validity of the assigned guard are not reconciled in real-time, leading to potential administrative negligence. Centralized digital tracking is identified as the primary defense against the misallocation of high-risk equipment and is a prerequisite for generating the legally defensible audit logs required by the National </w:t>
-      </w:r>
-      <w:r>
-        <w:rPr>
-          <w:rFonts w:ascii="Times New Roman" w:eastAsia="Times New Roman" w:hAnsi="Times New Roman" w:cs="Times New Roman"/>
-          <w:kern w:val="0"/>
-          <w14:ligatures w14:val="none"/>
-        </w:rPr>
-        <w:lastRenderedPageBreak/>
-        <w:t>Cybersecurity Plan 2022-2028 (DICT, 2024; PNP-SOSIA, 2022).</w:t>
+        <w:t>The systematic allocation of firearms is a matter of both Chain of Custody (CoC) and legal necessity under the Private Security Services Industry Act (Republic Act No. 11917, 2022). The law mandates strict accountability for firearms, requiring that only authorized, trained, and compliant guards carry weapons. Manual processes often suffer from "data drift," where the status of a weapon and the permit validity of the assigned guard are not reconciled in real-time, leading to potential administrative negligence. Centralized digital tracking is identified as the primary defense against the misallocation of high-risk equipment and is a prerequisite for generating the legally defensible audit logs required by the National Cybersecurity Plan 2022-2028 (DICT, 2024; PNP-SOSIA, 2022).</w:t>
       </w:r>
     </w:p>
     <w:p>
@@ -6240,7 +6566,16 @@
           <w:kern w:val="0"/>
           <w14:ligatures w14:val="none"/>
         </w:rPr>
-        <w:t>Complementing the language is the Axum framework, which is built on the Tokio asynchronous runtime. As highlighted by NashTech (2025), Axum is designed for high-performance web services where scalability and raw speed are non-negotiable. For SENTINEL, this means the Attendance Tracking and No-Show Detection modules can handle hundreds of simultaneous "check-in" requests during shift rotations without performance degradation. This "asynchronous-first" design allows the system to remain responsive even when processing complex relational logic across personnel, vehicle, and firearm databases.</w:t>
+        <w:t xml:space="preserve">Complementing the language is the Axum framework, which is built on the Tokio asynchronous runtime. As highlighted by NashTech (2025), Axum is designed for high-performance web services where scalability and raw speed are non-negotiable. For SENTINEL, this means the Attendance Tracking and No-Show Detection modules can handle hundreds of simultaneous "check-in" requests during shift rotations without performance degradation. This "asynchronous-first" design allows the system to remain responsive even </w:t>
+      </w:r>
+      <w:r>
+        <w:rPr>
+          <w:rFonts w:ascii="Times New Roman" w:eastAsia="Times New Roman" w:hAnsi="Times New Roman" w:cs="Times New Roman"/>
+          <w:kern w:val="0"/>
+          <w14:ligatures w14:val="none"/>
+        </w:rPr>
+        <w:lastRenderedPageBreak/>
+        <w:t>when processing complex relational logic across personnel, vehicle, and firearm databases.</w:t>
       </w:r>
     </w:p>
     <w:p>
@@ -6303,7 +6638,6 @@
           <w:kern w:val="0"/>
           <w14:ligatures w14:val="none"/>
         </w:rPr>
-        <w:lastRenderedPageBreak/>
         <w:tab/>
       </w:r>
       <w:r>
@@ -6381,7 +6715,16 @@
           <w:kern w:val="0"/>
           <w14:ligatures w14:val="none"/>
         </w:rPr>
-        <w:t xml:space="preserve"> by Shiyanbola, J. O., et al. (2023) on "Workforce Capacity Optimization" highlights a flaw in traditional security: "discovery lag." This occurs when supervisors only identify a personnel gap after a shift has failed. Their study demonstrates that real-time, asynchronous detection models allow for a proactive 11.8% improvement in site coverage reliability. Locally, ResearchGate (2025) cites a study by Respicio (2023) which found that Philippine security guards operating under digital monitoring exhibited significantly higher levels of alertness and punctuality because the system provided a transparent, inescapable layer of accountability that manual logs could not match.</w:t>
+        <w:t xml:space="preserve"> by Shiyanbola, J. O., et al. (2023) on "Workforce Capacity Optimization" highlights a flaw in traditional security: "discovery lag." This occurs when supervisors only identify a personnel gap after a shift has failed. Their study demonstrates that real-time, asynchronous detection models allow for a proactive 11.8% improvement in site coverage reliability. Locally, ResearchGate (2025) cites a study by Respicio (2023) which found that Philippine security guards operating under digital monitoring exhibited </w:t>
+      </w:r>
+      <w:r>
+        <w:rPr>
+          <w:rFonts w:ascii="Times New Roman" w:eastAsia="Times New Roman" w:hAnsi="Times New Roman" w:cs="Times New Roman"/>
+          <w:kern w:val="0"/>
+          <w14:ligatures w14:val="none"/>
+        </w:rPr>
+        <w:lastRenderedPageBreak/>
+        <w:t>significantly higher levels of alertness and punctuality because the system provided a transparent, inescapable layer of accountability that manual logs could not match.</w:t>
       </w:r>
       <w:r>
         <w:rPr>
@@ -6409,7 +6752,6 @@
           <w:rFonts w:ascii="Times New Roman" w:hAnsi="Times New Roman" w:cs="Times New Roman"/>
           <w:noProof/>
         </w:rPr>
-        <w:lastRenderedPageBreak/>
         <w:drawing>
           <wp:anchor distT="0" distB="0" distL="114300" distR="114300" simplePos="0" relativeHeight="251658240" behindDoc="0" locked="0" layoutInCell="1" allowOverlap="1" wp14:anchorId="534C5012" wp14:editId="46A5398E">
             <wp:simplePos x="0" y="0"/>
@@ -7926,7 +8268,25 @@
           <w:lang w:val="en-US"/>
           <w14:ligatures w14:val="none"/>
         </w:rPr>
-        <w:t>SENTINEL is implemented as a web-first integrated security operations platform with desktop and mobile runtime wrappers. Technology selection was based on concrete implementation requirements: role-based dashboards, secure API contracts, high-concurrency backend operations, traceable relational data, real-time tracking, and cross-platform delivery without codebase duplication. The proponents used the following technologies in the current implementation:</w:t>
+        <w:t xml:space="preserve">SENTINEL is implemented as a web-first integrated security operations platform with desktop and mobile runtime wrappers. Technology selection was based on concrete implementation requirements: role-based dashboards, secure API contracts, high-concurrency backend operations, </w:t>
+      </w:r>
+      <w:r>
+        <w:rPr>
+          <w:rFonts w:ascii="Times New Roman" w:eastAsia="Times New Roman" w:hAnsi="Times New Roman" w:cs="Times New Roman"/>
+          <w:kern w:val="0"/>
+          <w:lang w:val="en-US"/>
+          <w14:ligatures w14:val="none"/>
+        </w:rPr>
+        <w:t>traceable relational data, near-real-time tracking, and cross-platform delivery without codebase duplication.</w:t>
+      </w:r>
+      <w:r>
+        <w:rPr>
+          <w:rFonts w:ascii="Times New Roman" w:eastAsia="Times New Roman" w:hAnsi="Times New Roman" w:cs="Times New Roman"/>
+          <w:kern w:val="0"/>
+          <w:lang w:val="en-US"/>
+          <w14:ligatures w14:val="none"/>
+        </w:rPr>
+        <w:t xml:space="preserve"> The proponents used the following technologies in the current implementation:</w:t>
       </w:r>
       <w:r>
         <w:rPr>
@@ -7979,7 +8339,7 @@
           <w:lang w:val="en-US"/>
           <w14:ligatures w14:val="none"/>
         </w:rPr>
-        <w:t>React + TypeScript:</w:t>
+        <w:t>React + TypeScript: Used to build reusable, role-aware UI components and dashboard modules with strict typing.</w:t>
       </w:r>
       <w:r>
         <w:rPr>
@@ -7989,24 +8349,6 @@
           <w14:ligatures w14:val="none"/>
         </w:rPr>
         <w:t xml:space="preserve"> </w:t>
-      </w:r>
-      <w:r>
-        <w:rPr>
-          <w:rFonts w:ascii="Times New Roman" w:eastAsia="Times New Roman" w:hAnsi="Times New Roman" w:cs="Times New Roman"/>
-          <w:kern w:val="0"/>
-          <w:lang w:val="en-US"/>
-          <w14:ligatures w14:val="none"/>
-        </w:rPr>
-        <w:t>Will be u</w:t>
-      </w:r>
-      <w:r>
-        <w:rPr>
-          <w:rFonts w:ascii="Times New Roman" w:eastAsia="Times New Roman" w:hAnsi="Times New Roman" w:cs="Times New Roman"/>
-          <w:kern w:val="0"/>
-          <w:lang w:val="en-US"/>
-          <w14:ligatures w14:val="none"/>
-        </w:rPr>
-        <w:t xml:space="preserve">sed to build reusable, role-aware UI components and dashboard modules with strict typing. </w:t>
       </w:r>
     </w:p>
     <w:p>
@@ -8034,7 +8376,7 @@
           <w:lang w:val="en-US"/>
           <w14:ligatures w14:val="none"/>
         </w:rPr>
-        <w:t>Vite:</w:t>
+        <w:t>Vite: Used for local development and production build pipelines.</w:t>
       </w:r>
       <w:r>
         <w:rPr>
@@ -8044,24 +8386,6 @@
           <w14:ligatures w14:val="none"/>
         </w:rPr>
         <w:t xml:space="preserve"> </w:t>
-      </w:r>
-      <w:r>
-        <w:rPr>
-          <w:rFonts w:ascii="Times New Roman" w:eastAsia="Times New Roman" w:hAnsi="Times New Roman" w:cs="Times New Roman"/>
-          <w:kern w:val="0"/>
-          <w:lang w:val="en-US"/>
-          <w14:ligatures w14:val="none"/>
-        </w:rPr>
-        <w:t>Will be u</w:t>
-      </w:r>
-      <w:r>
-        <w:rPr>
-          <w:rFonts w:ascii="Times New Roman" w:eastAsia="Times New Roman" w:hAnsi="Times New Roman" w:cs="Times New Roman"/>
-          <w:kern w:val="0"/>
-          <w:lang w:val="en-US"/>
-          <w14:ligatures w14:val="none"/>
-        </w:rPr>
-        <w:t xml:space="preserve">sed for fast local startup and production build pipelines. </w:t>
       </w:r>
     </w:p>
     <w:p>
@@ -8089,16 +8413,7 @@
           <w:lang w:val="en-US"/>
           <w14:ligatures w14:val="none"/>
         </w:rPr>
-        <w:t>Tailwind CSS:</w:t>
-      </w:r>
-      <w:r>
-        <w:rPr>
-          <w:rFonts w:ascii="Times New Roman" w:eastAsia="Times New Roman" w:hAnsi="Times New Roman" w:cs="Times New Roman"/>
-          <w:kern w:val="0"/>
-          <w:lang w:val="en-US"/>
-          <w14:ligatures w14:val="none"/>
-        </w:rPr>
-        <w:t xml:space="preserve"> Will be</w:t>
+        <w:t>Tailwind CSS: Used for responsive interface implementation across command-center, operations, and resource modules.</w:t>
       </w:r>
       <w:r>
         <w:rPr>
@@ -8108,24 +8423,6 @@
           <w14:ligatures w14:val="none"/>
         </w:rPr>
         <w:t xml:space="preserve"> </w:t>
-      </w:r>
-      <w:r>
-        <w:rPr>
-          <w:rFonts w:ascii="Times New Roman" w:eastAsia="Times New Roman" w:hAnsi="Times New Roman" w:cs="Times New Roman"/>
-          <w:kern w:val="0"/>
-          <w:lang w:val="en-US"/>
-          <w14:ligatures w14:val="none"/>
-        </w:rPr>
-        <w:t>u</w:t>
-      </w:r>
-      <w:r>
-        <w:rPr>
-          <w:rFonts w:ascii="Times New Roman" w:eastAsia="Times New Roman" w:hAnsi="Times New Roman" w:cs="Times New Roman"/>
-          <w:kern w:val="0"/>
-          <w:lang w:val="en-US"/>
-          <w14:ligatures w14:val="none"/>
-        </w:rPr>
-        <w:t xml:space="preserve">sed for utility-driven, responsive interface implementation across command center, operations, and resource modules. </w:t>
       </w:r>
     </w:p>
     <w:p>
@@ -8173,16 +8470,16 @@
           <w:lang w:val="en-US"/>
           <w14:ligatures w14:val="none"/>
         </w:rPr>
-        <w:t>Will be u</w:t>
-      </w:r>
-      <w:r>
-        <w:rPr>
-          <w:rFonts w:ascii="Times New Roman" w:eastAsia="Times New Roman" w:hAnsi="Times New Roman" w:cs="Times New Roman"/>
-          <w:kern w:val="0"/>
-          <w:lang w:val="en-US"/>
-          <w14:ligatures w14:val="none"/>
-        </w:rPr>
-        <w:t xml:space="preserve">sed for operational map rendering, live marker </w:t>
+        <w:t>Used</w:t>
+      </w:r>
+      <w:r>
+        <w:rPr>
+          <w:rFonts w:ascii="Times New Roman" w:eastAsia="Times New Roman" w:hAnsi="Times New Roman" w:cs="Times New Roman"/>
+          <w:kern w:val="0"/>
+          <w:lang w:val="en-US"/>
+          <w14:ligatures w14:val="none"/>
+        </w:rPr>
+        <w:t xml:space="preserve"> for operational map rendering, live marker </w:t>
       </w:r>
       <w:r>
         <w:rPr>
@@ -8247,16 +8544,16 @@
           <w:lang w:val="en-US"/>
           <w14:ligatures w14:val="none"/>
         </w:rPr>
-        <w:t>Will be u</w:t>
-      </w:r>
-      <w:r>
-        <w:rPr>
-          <w:rFonts w:ascii="Times New Roman" w:eastAsia="Times New Roman" w:hAnsi="Times New Roman" w:cs="Times New Roman"/>
-          <w:kern w:val="0"/>
-          <w:lang w:val="en-US"/>
-          <w14:ligatures w14:val="none"/>
-        </w:rPr>
-        <w:t xml:space="preserve">sed for backend API handlers, middleware, and service orchestration. </w:t>
+        <w:t xml:space="preserve">Used </w:t>
+      </w:r>
+      <w:r>
+        <w:rPr>
+          <w:rFonts w:ascii="Times New Roman" w:eastAsia="Times New Roman" w:hAnsi="Times New Roman" w:cs="Times New Roman"/>
+          <w:kern w:val="0"/>
+          <w:lang w:val="en-US"/>
+          <w14:ligatures w14:val="none"/>
+        </w:rPr>
+        <w:t xml:space="preserve">for backend API handlers, middleware, and service orchestration. </w:t>
       </w:r>
     </w:p>
     <w:p>
@@ -8302,16 +8599,25 @@
           <w:lang w:val="en-US"/>
           <w14:ligatures w14:val="none"/>
         </w:rPr>
-        <w:t xml:space="preserve"> Will be </w:t>
-      </w:r>
-      <w:r>
-        <w:rPr>
-          <w:rFonts w:ascii="Times New Roman" w:eastAsia="Times New Roman" w:hAnsi="Times New Roman" w:cs="Times New Roman"/>
-          <w:kern w:val="0"/>
-          <w:lang w:val="en-US"/>
-          <w14:ligatures w14:val="none"/>
-        </w:rPr>
-        <w:t xml:space="preserve">sed as the central transactional database for users, approvals, schedules, attendance, firearms, vehicles, incidents, notifications, tracking points, and audit logs. </w:t>
+        <w:t xml:space="preserve"> </w:t>
+      </w:r>
+      <w:r>
+        <w:rPr>
+          <w:rFonts w:ascii="Times New Roman" w:eastAsia="Times New Roman" w:hAnsi="Times New Roman" w:cs="Times New Roman"/>
+          <w:kern w:val="0"/>
+          <w:lang w:val="en-US"/>
+          <w14:ligatures w14:val="none"/>
+        </w:rPr>
+        <w:t xml:space="preserve">Used </w:t>
+      </w:r>
+      <w:r>
+        <w:rPr>
+          <w:rFonts w:ascii="Times New Roman" w:eastAsia="Times New Roman" w:hAnsi="Times New Roman" w:cs="Times New Roman"/>
+          <w:kern w:val="0"/>
+          <w:lang w:val="en-US"/>
+          <w14:ligatures w14:val="none"/>
+        </w:rPr>
+        <w:t xml:space="preserve">as the central transactional database for users, approvals, schedules, attendance, firearms, vehicles, incidents, notifications, tracking points, and audit logs. </w:t>
       </w:r>
     </w:p>
     <w:p>
@@ -8357,16 +8663,25 @@
           <w:lang w:val="en-US"/>
           <w14:ligatures w14:val="none"/>
         </w:rPr>
-        <w:t xml:space="preserve"> Will be </w:t>
-      </w:r>
-      <w:r>
-        <w:rPr>
-          <w:rFonts w:ascii="Times New Roman" w:eastAsia="Times New Roman" w:hAnsi="Times New Roman" w:cs="Times New Roman"/>
-          <w:kern w:val="0"/>
-          <w:lang w:val="en-US"/>
-          <w14:ligatures w14:val="none"/>
-        </w:rPr>
-        <w:t xml:space="preserve">ed to standardize local backend/database orchestration and deployment parity. </w:t>
+        <w:t xml:space="preserve"> </w:t>
+      </w:r>
+      <w:r>
+        <w:rPr>
+          <w:rFonts w:ascii="Times New Roman" w:eastAsia="Times New Roman" w:hAnsi="Times New Roman" w:cs="Times New Roman"/>
+          <w:kern w:val="0"/>
+          <w:lang w:val="en-US"/>
+          <w14:ligatures w14:val="none"/>
+        </w:rPr>
+        <w:t xml:space="preserve">Used </w:t>
+      </w:r>
+      <w:r>
+        <w:rPr>
+          <w:rFonts w:ascii="Times New Roman" w:eastAsia="Times New Roman" w:hAnsi="Times New Roman" w:cs="Times New Roman"/>
+          <w:kern w:val="0"/>
+          <w:lang w:val="en-US"/>
+          <w14:ligatures w14:val="none"/>
+        </w:rPr>
+        <w:t xml:space="preserve">to standardize local backend/database orchestration and deployment parity. </w:t>
       </w:r>
     </w:p>
     <w:p>
@@ -8414,16 +8729,16 @@
           <w:lang w:val="en-US"/>
           <w14:ligatures w14:val="none"/>
         </w:rPr>
-        <w:t>Will be u</w:t>
-      </w:r>
-      <w:r>
-        <w:rPr>
-          <w:rFonts w:ascii="Times New Roman" w:eastAsia="Times New Roman" w:hAnsi="Times New Roman" w:cs="Times New Roman"/>
-          <w:kern w:val="0"/>
-          <w:lang w:val="en-US"/>
-          <w14:ligatures w14:val="none"/>
-        </w:rPr>
-        <w:t>sed to enforce protected access and stable session management across user roles.</w:t>
+        <w:t>Used</w:t>
+      </w:r>
+      <w:r>
+        <w:rPr>
+          <w:rFonts w:ascii="Times New Roman" w:eastAsia="Times New Roman" w:hAnsi="Times New Roman" w:cs="Times New Roman"/>
+          <w:kern w:val="0"/>
+          <w:lang w:val="en-US"/>
+          <w14:ligatures w14:val="none"/>
+        </w:rPr>
+        <w:t xml:space="preserve"> to enforce protected access and stable session management across user roles.</w:t>
       </w:r>
     </w:p>
     <w:p>
@@ -8471,16 +8786,16 @@
           <w:lang w:val="en-US"/>
           <w14:ligatures w14:val="none"/>
         </w:rPr>
-        <w:t>Will be u</w:t>
-      </w:r>
-      <w:r>
-        <w:rPr>
-          <w:rFonts w:ascii="Times New Roman" w:eastAsia="Times New Roman" w:hAnsi="Times New Roman" w:cs="Times New Roman"/>
-          <w:kern w:val="0"/>
-          <w:lang w:val="en-US"/>
-          <w14:ligatures w14:val="none"/>
-        </w:rPr>
-        <w:t xml:space="preserve">sed to package the web frontend for Android field deployment. </w:t>
+        <w:t>Used</w:t>
+      </w:r>
+      <w:r>
+        <w:rPr>
+          <w:rFonts w:ascii="Times New Roman" w:eastAsia="Times New Roman" w:hAnsi="Times New Roman" w:cs="Times New Roman"/>
+          <w:kern w:val="0"/>
+          <w:lang w:val="en-US"/>
+          <w14:ligatures w14:val="none"/>
+        </w:rPr>
+        <w:t xml:space="preserve"> to package the web frontend for Android field deployment. </w:t>
       </w:r>
     </w:p>
     <w:p>
@@ -8526,16 +8841,16 @@
           <w:lang w:val="en-US"/>
           <w14:ligatures w14:val="none"/>
         </w:rPr>
-        <w:t>Will be u</w:t>
-      </w:r>
-      <w:r>
-        <w:rPr>
-          <w:rFonts w:ascii="Times New Roman" w:eastAsia="Times New Roman" w:hAnsi="Times New Roman" w:cs="Times New Roman"/>
-          <w:kern w:val="0"/>
-          <w:lang w:val="en-US"/>
-          <w14:ligatures w14:val="none"/>
-        </w:rPr>
-        <w:t xml:space="preserve">sed to package the same frontend for Windows desktop command-center deployment. </w:t>
+        <w:t>Used</w:t>
+      </w:r>
+      <w:r>
+        <w:rPr>
+          <w:rFonts w:ascii="Times New Roman" w:eastAsia="Times New Roman" w:hAnsi="Times New Roman" w:cs="Times New Roman"/>
+          <w:kern w:val="0"/>
+          <w:lang w:val="en-US"/>
+          <w14:ligatures w14:val="none"/>
+        </w:rPr>
+        <w:t xml:space="preserve"> to package the same frontend for Windows desktop command-center deployment. </w:t>
       </w:r>
     </w:p>
     <w:p>
@@ -8581,7 +8896,25 @@
           <w:lang w:val="en-US"/>
           <w14:ligatures w14:val="none"/>
         </w:rPr>
-        <w:t xml:space="preserve"> Will be used for transactional email delivery such as verification codes, password reset codes, and operational notifications.</w:t>
+        <w:t xml:space="preserve"> </w:t>
+      </w:r>
+      <w:r>
+        <w:rPr>
+          <w:rFonts w:ascii="Times New Roman" w:eastAsia="Times New Roman" w:hAnsi="Times New Roman" w:cs="Times New Roman"/>
+          <w:kern w:val="0"/>
+          <w:lang w:val="en-US"/>
+          <w14:ligatures w14:val="none"/>
+        </w:rPr>
+        <w:t>Used</w:t>
+      </w:r>
+      <w:r>
+        <w:rPr>
+          <w:rFonts w:ascii="Times New Roman" w:eastAsia="Times New Roman" w:hAnsi="Times New Roman" w:cs="Times New Roman"/>
+          <w:kern w:val="0"/>
+          <w:lang w:val="en-US"/>
+          <w14:ligatures w14:val="none"/>
+        </w:rPr>
+        <w:t xml:space="preserve"> for transactional email delivery such as verification codes, password reset codes, and operational notifications.</w:t>
       </w:r>
     </w:p>
     <w:p>
@@ -8627,7 +8960,25 @@
           <w:lang w:val="en-US"/>
           <w14:ligatures w14:val="none"/>
         </w:rPr>
-        <w:t xml:space="preserve"> Will be used as a cloud deployment platform for backend runtime and managed service hosting.</w:t>
+        <w:t xml:space="preserve"> </w:t>
+      </w:r>
+      <w:r>
+        <w:rPr>
+          <w:rFonts w:ascii="Times New Roman" w:eastAsia="Times New Roman" w:hAnsi="Times New Roman" w:cs="Times New Roman"/>
+          <w:kern w:val="0"/>
+          <w:lang w:val="en-US"/>
+          <w14:ligatures w14:val="none"/>
+        </w:rPr>
+        <w:t>Used</w:t>
+      </w:r>
+      <w:r>
+        <w:rPr>
+          <w:rFonts w:ascii="Times New Roman" w:eastAsia="Times New Roman" w:hAnsi="Times New Roman" w:cs="Times New Roman"/>
+          <w:kern w:val="0"/>
+          <w:lang w:val="en-US"/>
+          <w14:ligatures w14:val="none"/>
+        </w:rPr>
+        <w:t xml:space="preserve"> as a cloud deployment platform for backend runtime and managed service hosting.</w:t>
       </w:r>
     </w:p>
     <w:p>
@@ -8673,7 +9024,25 @@
           <w:lang w:val="en-US"/>
           <w14:ligatures w14:val="none"/>
         </w:rPr>
-        <w:t xml:space="preserve"> Will be used for domain registration and domain-level DNS management.</w:t>
+        <w:t xml:space="preserve"> </w:t>
+      </w:r>
+      <w:r>
+        <w:rPr>
+          <w:rFonts w:ascii="Times New Roman" w:eastAsia="Times New Roman" w:hAnsi="Times New Roman" w:cs="Times New Roman"/>
+          <w:kern w:val="0"/>
+          <w:lang w:val="en-US"/>
+          <w14:ligatures w14:val="none"/>
+        </w:rPr>
+        <w:t>Used</w:t>
+      </w:r>
+      <w:r>
+        <w:rPr>
+          <w:rFonts w:ascii="Times New Roman" w:eastAsia="Times New Roman" w:hAnsi="Times New Roman" w:cs="Times New Roman"/>
+          <w:kern w:val="0"/>
+          <w:lang w:val="en-US"/>
+          <w14:ligatures w14:val="none"/>
+        </w:rPr>
+        <w:t xml:space="preserve"> for domain registration and domain-level DNS management.</w:t>
       </w:r>
     </w:p>
     <w:p>
@@ -8719,7 +9088,25 @@
           <w:lang w:val="en-US"/>
           <w14:ligatures w14:val="none"/>
         </w:rPr>
-        <w:t xml:space="preserve"> Will be used for version control, collaboration,</w:t>
+        <w:t xml:space="preserve"> </w:t>
+      </w:r>
+      <w:r>
+        <w:rPr>
+          <w:rFonts w:ascii="Times New Roman" w:eastAsia="Times New Roman" w:hAnsi="Times New Roman" w:cs="Times New Roman"/>
+          <w:kern w:val="0"/>
+          <w:lang w:val="en-US"/>
+          <w14:ligatures w14:val="none"/>
+        </w:rPr>
+        <w:t>Used</w:t>
+      </w:r>
+      <w:r>
+        <w:rPr>
+          <w:rFonts w:ascii="Times New Roman" w:eastAsia="Times New Roman" w:hAnsi="Times New Roman" w:cs="Times New Roman"/>
+          <w:kern w:val="0"/>
+          <w:lang w:val="en-US"/>
+          <w14:ligatures w14:val="none"/>
+        </w:rPr>
+        <w:t xml:space="preserve"> for version control, collaboration,</w:t>
       </w:r>
       <w:r>
         <w:rPr>
@@ -8821,36 +9208,16 @@
           <w:lang w:val="en-US"/>
           <w14:ligatures w14:val="none"/>
         </w:rPr>
-        <w:t>Will be u</w:t>
-      </w:r>
-      <w:r>
-        <w:rPr>
-          <w:rFonts w:ascii="Times New Roman" w:eastAsia="Times New Roman" w:hAnsi="Times New Roman" w:cs="Times New Roman"/>
-          <w:kern w:val="0"/>
-          <w:lang w:val="en-US"/>
-          <w14:ligatures w14:val="none"/>
-        </w:rPr>
-        <w:t xml:space="preserve">sed to generate, encode, and manage the release keystore required for signed APK and AAB distribution, supporting </w:t>
-      </w:r>
-      <w:proofErr w:type="gramStart"/>
-      <w:r>
-        <w:rPr>
-          <w:rFonts w:ascii="Times New Roman" w:eastAsia="Times New Roman" w:hAnsi="Times New Roman" w:cs="Times New Roman"/>
-          <w:kern w:val="0"/>
-          <w:lang w:val="en-US"/>
-          <w14:ligatures w14:val="none"/>
-        </w:rPr>
-        <w:t>controlled</w:t>
-      </w:r>
-      <w:proofErr w:type="gramEnd"/>
-      <w:r>
-        <w:rPr>
-          <w:rFonts w:ascii="Times New Roman" w:eastAsia="Times New Roman" w:hAnsi="Times New Roman" w:cs="Times New Roman"/>
-          <w:kern w:val="0"/>
-          <w:lang w:val="en-US"/>
-          <w14:ligatures w14:val="none"/>
-        </w:rPr>
-        <w:t xml:space="preserve"> and verifiable release governance for the Android deployment target.</w:t>
+        <w:t>Used</w:t>
+      </w:r>
+      <w:r>
+        <w:rPr>
+          <w:rFonts w:ascii="Times New Roman" w:eastAsia="Times New Roman" w:hAnsi="Times New Roman" w:cs="Times New Roman"/>
+          <w:kern w:val="0"/>
+          <w:lang w:val="en-US"/>
+          <w14:ligatures w14:val="none"/>
+        </w:rPr>
+        <w:t xml:space="preserve"> to generate, encode, and manage the release keystore required for signed APK and AAB distribution, supporting controlled and verifiable release governance for the Android deployment target.</w:t>
       </w:r>
     </w:p>
     <w:p>
@@ -24033,87 +24400,7 @@
                 <w:lang w:val="en-US"/>
                 <w14:ligatures w14:val="none"/>
               </w:rPr>
-              <w:t xml:space="preserve">SENTINEL manages </w:t>
-            </w:r>
-            <w:proofErr w:type="gramStart"/>
-            <w:r>
-              <w:rPr>
-                <w:rFonts w:ascii="Times New Roman" w:eastAsia="Times New Roman" w:hAnsi="Times New Roman" w:cs="Times New Roman"/>
-                <w:kern w:val="0"/>
-                <w:lang w:val="en-US"/>
-                <w14:ligatures w14:val="none"/>
-              </w:rPr>
-              <w:t>firearm</w:t>
-            </w:r>
-            <w:proofErr w:type="gramEnd"/>
-            <w:r>
-              <w:rPr>
-                <w:rFonts w:ascii="Times New Roman" w:eastAsia="Times New Roman" w:hAnsi="Times New Roman" w:cs="Times New Roman"/>
-                <w:kern w:val="0"/>
-                <w:lang w:val="en-US"/>
-                <w14:ligatures w14:val="none"/>
-              </w:rPr>
-              <w:t xml:space="preserve">, </w:t>
-            </w:r>
-            <w:proofErr w:type="gramStart"/>
-            <w:r>
-              <w:rPr>
-                <w:rFonts w:ascii="Times New Roman" w:eastAsia="Times New Roman" w:hAnsi="Times New Roman" w:cs="Times New Roman"/>
-                <w:kern w:val="0"/>
-                <w:lang w:val="en-US"/>
-                <w14:ligatures w14:val="none"/>
-              </w:rPr>
-              <w:t>permit</w:t>
-            </w:r>
-            <w:proofErr w:type="gramEnd"/>
-            <w:r>
-              <w:rPr>
-                <w:rFonts w:ascii="Times New Roman" w:eastAsia="Times New Roman" w:hAnsi="Times New Roman" w:cs="Times New Roman"/>
-                <w:kern w:val="0"/>
-                <w:lang w:val="en-US"/>
-                <w14:ligatures w14:val="none"/>
-              </w:rPr>
-              <w:t xml:space="preserve">, </w:t>
-            </w:r>
-            <w:proofErr w:type="gramStart"/>
-            <w:r>
-              <w:rPr>
-                <w:rFonts w:ascii="Times New Roman" w:eastAsia="Times New Roman" w:hAnsi="Times New Roman" w:cs="Times New Roman"/>
-                <w:kern w:val="0"/>
-                <w:lang w:val="en-US"/>
-                <w14:ligatures w14:val="none"/>
-              </w:rPr>
-              <w:t>vehicle</w:t>
-            </w:r>
-            <w:proofErr w:type="gramEnd"/>
-            <w:r>
-              <w:rPr>
-                <w:rFonts w:ascii="Times New Roman" w:eastAsia="Times New Roman" w:hAnsi="Times New Roman" w:cs="Times New Roman"/>
-                <w:kern w:val="0"/>
-                <w:lang w:val="en-US"/>
-                <w14:ligatures w14:val="none"/>
-              </w:rPr>
-              <w:t xml:space="preserve">, </w:t>
-            </w:r>
-            <w:proofErr w:type="gramStart"/>
-            <w:r>
-              <w:rPr>
-                <w:rFonts w:ascii="Times New Roman" w:eastAsia="Times New Roman" w:hAnsi="Times New Roman" w:cs="Times New Roman"/>
-                <w:kern w:val="0"/>
-                <w:lang w:val="en-US"/>
-                <w14:ligatures w14:val="none"/>
-              </w:rPr>
-              <w:t>trip</w:t>
-            </w:r>
-            <w:proofErr w:type="gramEnd"/>
-            <w:r>
-              <w:rPr>
-                <w:rFonts w:ascii="Times New Roman" w:eastAsia="Times New Roman" w:hAnsi="Times New Roman" w:cs="Times New Roman"/>
-                <w:kern w:val="0"/>
-                <w:lang w:val="en-US"/>
-                <w14:ligatures w14:val="none"/>
-              </w:rPr>
-              <w:t>, and maintenance workflows through centralized and auditable records.</w:t>
+              <w:t>SENTINEL manages firearm, permit, vehicle, trip, and maintenance workflows through centralized and auditable records.</w:t>
             </w:r>
           </w:p>
         </w:tc>
@@ -24190,27 +24477,7 @@
                 <w:lang w:val="en-US"/>
                 <w14:ligatures w14:val="none"/>
               </w:rPr>
-              <w:t xml:space="preserve">Incident reporting and field monitoring </w:t>
-            </w:r>
-            <w:proofErr w:type="gramStart"/>
-            <w:r>
-              <w:rPr>
-                <w:rFonts w:ascii="Times New Roman" w:eastAsia="Times New Roman" w:hAnsi="Times New Roman" w:cs="Times New Roman"/>
-                <w:kern w:val="0"/>
-                <w:lang w:val="en-US"/>
-                <w14:ligatures w14:val="none"/>
-              </w:rPr>
-              <w:t>rely</w:t>
-            </w:r>
-            <w:proofErr w:type="gramEnd"/>
-            <w:r>
-              <w:rPr>
-                <w:rFonts w:ascii="Times New Roman" w:eastAsia="Times New Roman" w:hAnsi="Times New Roman" w:cs="Times New Roman"/>
-                <w:kern w:val="0"/>
-                <w:lang w:val="en-US"/>
-                <w14:ligatures w14:val="none"/>
-              </w:rPr>
-              <w:t xml:space="preserve"> on manual updates, weak patrol visibility, and delayed supervisory awareness.</w:t>
+              <w:t>Incident reporting and field monitoring rely on manual updates, weak patrol visibility, and delayed supervisory awareness.</w:t>
             </w:r>
           </w:p>
         </w:tc>
@@ -24439,27 +24706,16 @@
           <w:lang w:val="en-US"/>
           <w14:ligatures w14:val="none"/>
         </w:rPr>
-        <w:t xml:space="preserve">The requirements baseline for SENTINEL </w:t>
-      </w:r>
-      <w:proofErr w:type="gramStart"/>
-      <w:r>
-        <w:rPr>
-          <w:rFonts w:ascii="Times New Roman" w:eastAsia="Times New Roman" w:hAnsi="Times New Roman" w:cs="Times New Roman"/>
-          <w:kern w:val="0"/>
-          <w:lang w:val="en-US"/>
-          <w14:ligatures w14:val="none"/>
-        </w:rPr>
-        <w:t>was</w:t>
-      </w:r>
-      <w:proofErr w:type="gramEnd"/>
-      <w:r>
-        <w:rPr>
-          <w:rFonts w:ascii="Times New Roman" w:eastAsia="Times New Roman" w:hAnsi="Times New Roman" w:cs="Times New Roman"/>
-          <w:kern w:val="0"/>
-          <w:lang w:val="en-US"/>
-          <w14:ligatures w14:val="none"/>
-        </w:rPr>
-        <w:t xml:space="preserve"> defined from actual private-security operational pain points: fragmented coordination, delayed visibility, compliance exposure, and weak traceability of sensitive asset workflows. Based on current implementation, the requirements analysis prioritizes role-governed access, real-time operational awareness, and </w:t>
+        <w:t xml:space="preserve">The requirements baseline for SENTINEL was defined from actual private-security operational pain points: fragmented coordination, delayed visibility, compliance exposure, and weak traceability of sensitive asset workflows. </w:t>
+      </w:r>
+      <w:r>
+        <w:rPr>
+          <w:rFonts w:ascii="Times New Roman" w:eastAsia="Times New Roman" w:hAnsi="Times New Roman" w:cs="Times New Roman"/>
+          <w:kern w:val="0"/>
+          <w:lang w:val="en-US"/>
+          <w14:ligatures w14:val="none"/>
+        </w:rPr>
+        <w:t xml:space="preserve">Based on current implementation, the requirements analysis prioritizes role-governed access, near-real-time operational awareness, </w:t>
       </w:r>
       <w:r>
         <w:rPr>
@@ -24469,7 +24725,7 @@
           <w14:ligatures w14:val="none"/>
         </w:rPr>
         <w:lastRenderedPageBreak/>
-        <w:t>auditable process execution across personnel, equipment, vehicle, incident, and analytics domains.</w:t>
+        <w:t>and auditable process execution across personnel, equipment, vehicle, incident, and analytics domains.</w:t>
       </w:r>
       <w:r>
         <w:rPr>
@@ -24497,47 +24753,7 @@
           <w:lang w:val="en-US"/>
           <w14:ligatures w14:val="none"/>
         </w:rPr>
-        <w:t xml:space="preserve">Technology and software selection was treated as a requirements decision, not only an implementation preference. For the frontend layer, </w:t>
-      </w:r>
-      <w:proofErr w:type="gramStart"/>
-      <w:r>
-        <w:rPr>
-          <w:rFonts w:ascii="Times New Roman" w:eastAsia="Times New Roman" w:hAnsi="Times New Roman" w:cs="Times New Roman"/>
-          <w:kern w:val="0"/>
-          <w:lang w:val="en-US"/>
-          <w14:ligatures w14:val="none"/>
-        </w:rPr>
-        <w:t>React</w:t>
-      </w:r>
-      <w:proofErr w:type="gramEnd"/>
-      <w:r>
-        <w:rPr>
-          <w:rFonts w:ascii="Times New Roman" w:eastAsia="Times New Roman" w:hAnsi="Times New Roman" w:cs="Times New Roman"/>
-          <w:kern w:val="0"/>
-          <w:lang w:val="en-US"/>
-          <w14:ligatures w14:val="none"/>
-        </w:rPr>
-        <w:t xml:space="preserve"> + TypeScript + Vite was selected to satisfy modular dashboard composition, strict role-based rendering, and rapid iteration. Angular was considered because it provides a full framework with built-in dependency </w:t>
-      </w:r>
-      <w:proofErr w:type="gramStart"/>
-      <w:r>
-        <w:rPr>
-          <w:rFonts w:ascii="Times New Roman" w:eastAsia="Times New Roman" w:hAnsi="Times New Roman" w:cs="Times New Roman"/>
-          <w:kern w:val="0"/>
-          <w:lang w:val="en-US"/>
-          <w14:ligatures w14:val="none"/>
-        </w:rPr>
-        <w:t>injection</w:t>
-      </w:r>
-      <w:proofErr w:type="gramEnd"/>
-      <w:r>
-        <w:rPr>
-          <w:rFonts w:ascii="Times New Roman" w:eastAsia="Times New Roman" w:hAnsi="Times New Roman" w:cs="Times New Roman"/>
-          <w:kern w:val="0"/>
-          <w:lang w:val="en-US"/>
-          <w14:ligatures w14:val="none"/>
-        </w:rPr>
-        <w:t xml:space="preserve"> and strong conventions; however, its heavier project structure was less aligned with the team's component-by-component delivery pace. Vue was considered for its simpler learning curve and progressive adoption model, but the existing codebase and shared component strategy were already established around React patterns. Plain JavaScript React was also considered, but TypeScript was chosen to reduce contract errors in role logic, API payload mapping, and cross-module state handling.</w:t>
+        <w:t>Technology and software selection was treated as a requirements decision, not only an implementation preference. For the frontend layer, React + TypeScript + Vite was selected to satisfy modular dashboard composition, strict role-based rendering, and rapid iteration. Angular was considered because it provides a full framework with built-in dependency injection and strong conventions; however, its heavier project structure was less aligned with the team's component-by-component delivery pace. Vue was considered for its simpler learning curve and progressive adoption model, but the existing codebase and shared component strategy were already established around React patterns. Plain JavaScript React was also considered, but TypeScript was chosen to reduce contract errors in role logic, API payload mapping, and cross-module state handling.</w:t>
       </w:r>
       <w:r>
         <w:rPr>
@@ -24565,27 +24781,7 @@
           <w:lang w:val="en-US"/>
           <w14:ligatures w14:val="none"/>
         </w:rPr>
-        <w:t xml:space="preserve">For backend processing, Rust + Axum was selected to meet concurrency, security, and reliability requirements for authentication, approvals, tracking, and analytics endpoints. Node.js + Express was considered because of rapid API prototyping and broad ecosystem support, but the project prioritized compile-time safety and stricter runtime </w:t>
-      </w:r>
-      <w:proofErr w:type="gramStart"/>
-      <w:r>
-        <w:rPr>
-          <w:rFonts w:ascii="Times New Roman" w:eastAsia="Times New Roman" w:hAnsi="Times New Roman" w:cs="Times New Roman"/>
-          <w:kern w:val="0"/>
-          <w:lang w:val="en-US"/>
-          <w14:ligatures w14:val="none"/>
-        </w:rPr>
-        <w:t>guarantees</w:t>
-      </w:r>
-      <w:proofErr w:type="gramEnd"/>
-      <w:r>
-        <w:rPr>
-          <w:rFonts w:ascii="Times New Roman" w:eastAsia="Times New Roman" w:hAnsi="Times New Roman" w:cs="Times New Roman"/>
-          <w:kern w:val="0"/>
-          <w:lang w:val="en-US"/>
-          <w14:ligatures w14:val="none"/>
-        </w:rPr>
-        <w:t xml:space="preserve"> for security-sensitive operations. Java + Spring Boot was considered for enterprise-grade structure and mature tooling, yet it introduces a larger operational footprint and greater configuration overhead for this capstone scope. Go + Gin/Fiber was also considered for performance and simplicity, but Rust + Axum better matched the team's objective of memory-safe, middleware-centric API enforcement with fine-grained control.</w:t>
+        <w:t>For backend processing, Rust + Axum was selected to meet concurrency, security, and reliability requirements for authentication, approvals, tracking, and analytics endpoints. Node.js + Express was considered because of rapid API prototyping and broad ecosystem support, but the project prioritized compile-time safety and stricter runtime guarantees for security-sensitive operations. Java + Spring Boot was considered for enterprise-grade structure and mature tooling, yet it introduces a larger operational footprint and greater configuration overhead for this capstone scope. Go + Gin/Fiber was also considered for performance and simplicity, but Rust + Axum better matched the team's objective of memory-safe, middleware-centric API enforcement with fine-grained control.</w:t>
       </w:r>
       <w:r>
         <w:rPr>
@@ -24651,7 +24847,16 @@
           <w:lang w:val="en-US"/>
           <w14:ligatures w14:val="none"/>
         </w:rPr>
-        <w:t>For mapping and geospatial visualization, OpenStreetMap + Leaflet was selected to satisfy real-time operational map requirements, client-site management, and location marker rendering while retaining implementation control. Google Maps Platform was considered because it provides high-quality basemaps, geocoding, and route services, but usage-based billing and API quota sensitivity are less favorable for continuous monitoring views. Mapbox was considered because it offers strong vector map tooling and customizable styles, yet recurring usage costs and token-governed access create additional operational dependency for long-running dashboards. ArcGIS was considered for enterprise GIS depth, but its platform complexity exceeds current implementation needs. OpenStreetMap + Leaflet was therefore chosen for cost efficiency, integration flexibility, and direct alignment with the implemented web map architecture.</w:t>
+        <w:t>For mapping and geospatial visualization, OpenStreetMap + Leaflet was selected to satisfy near-real-time operational map requirements, client-site management, and location marker rendering while retaining implementation control.</w:t>
+      </w:r>
+      <w:r>
+        <w:rPr>
+          <w:rFonts w:ascii="Times New Roman" w:eastAsia="Times New Roman" w:hAnsi="Times New Roman" w:cs="Times New Roman"/>
+          <w:kern w:val="0"/>
+          <w:lang w:val="en-US"/>
+          <w14:ligatures w14:val="none"/>
+        </w:rPr>
+        <w:t xml:space="preserve"> Google Maps Platform was considered because it provides high-quality basemaps, geocoding, and route services, but usage-based billing and API quota sensitivity are less favorable for continuous monitoring views. Mapbox was considered because it offers strong vector map tooling and customizable styles, yet recurring usage costs and token-governed access create additional operational dependency for long-running dashboards. ArcGIS was considered for enterprise GIS depth, but its platform complexity exceeds current implementation needs. OpenStreetMap + Leaflet was therefore chosen for cost efficiency, integration flexibility, and direct alignment with the implemented web map architecture.</w:t>
       </w:r>
       <w:r>
         <w:rPr>
@@ -24688,47 +24893,16 @@
           <w:lang w:val="en-US"/>
           <w14:ligatures w14:val="none"/>
         </w:rPr>
-        <w:t xml:space="preserve">For real-time operational visibility, websocket streaming with polling fallback was selected as a hybrid requirement. Server-Sent Events (SSE) </w:t>
-      </w:r>
-      <w:proofErr w:type="gramStart"/>
-      <w:r>
-        <w:rPr>
-          <w:rFonts w:ascii="Times New Roman" w:eastAsia="Times New Roman" w:hAnsi="Times New Roman" w:cs="Times New Roman"/>
-          <w:kern w:val="0"/>
-          <w:lang w:val="en-US"/>
-          <w14:ligatures w14:val="none"/>
-        </w:rPr>
-        <w:t>was</w:t>
-      </w:r>
-      <w:proofErr w:type="gramEnd"/>
-      <w:r>
-        <w:rPr>
-          <w:rFonts w:ascii="Times New Roman" w:eastAsia="Times New Roman" w:hAnsi="Times New Roman" w:cs="Times New Roman"/>
-          <w:kern w:val="0"/>
-          <w:lang w:val="en-US"/>
-          <w14:ligatures w14:val="none"/>
-        </w:rPr>
-        <w:t xml:space="preserve"> considered because it simplifies one-way streaming, but websocket transport better supports bidirectional session handling and live snapshot exchange patterns used in tracking views. Polling-only models were considered for implementation simplicity, but they </w:t>
-      </w:r>
-      <w:proofErr w:type="gramStart"/>
-      <w:r>
-        <w:rPr>
-          <w:rFonts w:ascii="Times New Roman" w:eastAsia="Times New Roman" w:hAnsi="Times New Roman" w:cs="Times New Roman"/>
-          <w:kern w:val="0"/>
-          <w:lang w:val="en-US"/>
-          <w14:ligatures w14:val="none"/>
-        </w:rPr>
-        <w:t>introduce</w:t>
-      </w:r>
-      <w:proofErr w:type="gramEnd"/>
-      <w:r>
-        <w:rPr>
-          <w:rFonts w:ascii="Times New Roman" w:eastAsia="Times New Roman" w:hAnsi="Times New Roman" w:cs="Times New Roman"/>
-          <w:kern w:val="0"/>
-          <w:lang w:val="en-US"/>
-          <w14:ligatures w14:val="none"/>
-        </w:rPr>
-        <w:t xml:space="preserve"> higher latency and unnecessary repeated requests for active command-center monitoring. The implemented websocket-plus-polling model balances responsiveness with continuity when persistent connections are interrupted.</w:t>
+        <w:t>For near-real-time operational visibility, websocket streaming with polling fallback was selected as a hybrid requirement.</w:t>
+      </w:r>
+      <w:r>
+        <w:rPr>
+          <w:rFonts w:ascii="Times New Roman" w:eastAsia="Times New Roman" w:hAnsi="Times New Roman" w:cs="Times New Roman"/>
+          <w:kern w:val="0"/>
+          <w:lang w:val="en-US"/>
+          <w14:ligatures w14:val="none"/>
+        </w:rPr>
+        <w:t xml:space="preserve"> Server-Sent Events (SSE) was considered because it simplifies one-way streaming, but websocket transport better supports bidirectional session handling and live snapshot exchange patterns used in tracking views. Polling-only models were considered for implementation simplicity, but they introduce higher latency and unnecessary repeated requests for active command-center monitoring. The implemented websocket-plus-polling model balances responsiveness with continuity when persistent connections are interrupted.</w:t>
       </w:r>
       <w:r>
         <w:rPr>
@@ -24775,27 +24949,16 @@
           <w14:ligatures w14:val="none"/>
         </w:rPr>
         <w:lastRenderedPageBreak/>
-        <w:t xml:space="preserve">separate business logic per platform. Electron was considered for desktop packaging because of mature tooling, but Tauri </w:t>
-      </w:r>
-      <w:proofErr w:type="gramStart"/>
-      <w:r>
-        <w:rPr>
-          <w:rFonts w:ascii="Times New Roman" w:eastAsia="Times New Roman" w:hAnsi="Times New Roman" w:cs="Times New Roman"/>
-          <w:kern w:val="0"/>
-          <w:lang w:val="en-US"/>
-          <w14:ligatures w14:val="none"/>
-        </w:rPr>
-        <w:t>was preferred</w:t>
-      </w:r>
-      <w:proofErr w:type="gramEnd"/>
-      <w:r>
-        <w:rPr>
-          <w:rFonts w:ascii="Times New Roman" w:eastAsia="Times New Roman" w:hAnsi="Times New Roman" w:cs="Times New Roman"/>
-          <w:kern w:val="0"/>
-          <w:lang w:val="en-US"/>
-          <w14:ligatures w14:val="none"/>
-        </w:rPr>
-        <w:t xml:space="preserve"> for a lighter runtime footprint and tighter security posture. React Native and fully native Android/desktop tracks were considered for platform-specific delivery, but they would require duplicate UI and integration maintenance. The chosen wrapper strategy preserves feature parity across Web, Desktop, and Android while reducing implementation divergence.</w:t>
+        <w:t xml:space="preserve">separate business logic per platform. Electron was considered for desktop packaging because of mature tooling, but Tauri was preferred for a lighter runtime footprint and tighter security posture. React Native and fully native Android/desktop tracks were considered for platform-specific delivery, but they would require duplicate UI and integration maintenance. </w:t>
+      </w:r>
+      <w:r>
+        <w:rPr>
+          <w:rFonts w:ascii="Times New Roman" w:eastAsia="Times New Roman" w:hAnsi="Times New Roman" w:cs="Times New Roman"/>
+          <w:kern w:val="0"/>
+          <w:lang w:val="en-US"/>
+          <w14:ligatures w14:val="none"/>
+        </w:rPr>
+        <w:t>The chosen wrapper strategy reuses the Web application codebase across the configured Windows desktop and Android packaging targets, reducing implementation divergence. Full platform parity remains subject to packaged-runtime validation.</w:t>
       </w:r>
       <w:r>
         <w:rPr>
@@ -24823,27 +24986,7 @@
           <w:lang w:val="en-US"/>
           <w14:ligatures w14:val="none"/>
         </w:rPr>
-        <w:t xml:space="preserve">For operational tooling, Docker/Compose, managed runtime deployment, and version-controlled release workflows were selected to satisfy reproducibility and maintainability requirements. Manual host-based installation was considered but </w:t>
-      </w:r>
-      <w:proofErr w:type="gramStart"/>
-      <w:r>
-        <w:rPr>
-          <w:rFonts w:ascii="Times New Roman" w:eastAsia="Times New Roman" w:hAnsi="Times New Roman" w:cs="Times New Roman"/>
-          <w:kern w:val="0"/>
-          <w:lang w:val="en-US"/>
-          <w14:ligatures w14:val="none"/>
-        </w:rPr>
-        <w:t>increases</w:t>
-      </w:r>
-      <w:proofErr w:type="gramEnd"/>
-      <w:r>
-        <w:rPr>
-          <w:rFonts w:ascii="Times New Roman" w:eastAsia="Times New Roman" w:hAnsi="Times New Roman" w:cs="Times New Roman"/>
-          <w:kern w:val="0"/>
-          <w:lang w:val="en-US"/>
-          <w14:ligatures w14:val="none"/>
-        </w:rPr>
-        <w:t xml:space="preserve"> environment drift and onboarding inconsistency. Alternative orchestration-heavy stacks (for example, immediate Kubernetes adoption) were considered excessive for current scale and capstone constraints. The selected tooling stack provides repeatable setup, traceable change history, and controlled release validation that directly supports the implemented system lifecycle.</w:t>
+        <w:t>For operational tooling, Docker/Compose, managed runtime deployment, and version-controlled release workflows were selected to satisfy reproducibility and maintainability requirements. Manual host-based installation was considered but increases environment drift and onboarding inconsistency. Alternative orchestration-heavy stacks (for example, immediate Kubernetes adoption) were considered excessive for current scale and capstone constraints. The selected tooling stack provides repeatable setup, traceable change history, and controlled release validation that directly supports the implemented system lifecycle.</w:t>
       </w:r>
       <w:r>
         <w:rPr>
@@ -24927,14 +25070,14 @@
         <w:rPr>
           <w:rFonts w:ascii="Times New Roman" w:hAnsi="Times New Roman" w:cs="Times New Roman"/>
         </w:rPr>
-        <w:t xml:space="preserve">The system shall support administrator-mediated onboarding, verification, approval, secure authentication, password-reset workflows, role-based access control, mandatory legal-policy acceptance, cross-platform runtime delivery across Web, </w:t>
+        <w:t xml:space="preserve">The system shall support administrator-mediated onboarding, verification, approval, secure authentication, password-reset workflows, role-based access control, mandatory legal-policy </w:t>
       </w:r>
       <w:r>
         <w:rPr>
           <w:rFonts w:ascii="Times New Roman" w:hAnsi="Times New Roman" w:cs="Times New Roman"/>
         </w:rPr>
         <w:lastRenderedPageBreak/>
-        <w:t>Windows desktop, and Android, and access to a release-oriented documentation portal.</w:t>
+        <w:t>acceptance, and access through the implemented Web application, with configured Windows desktop and Android deployment targets.</w:t>
       </w:r>
     </w:p>
     <w:p>
@@ -25078,19 +25221,14 @@
         <w:rPr>
           <w:rFonts w:ascii="Times New Roman" w:hAnsi="Times New Roman" w:cs="Times New Roman"/>
         </w:rPr>
-        <w:t xml:space="preserve">The system shall enable supervisor users to monitor schedules, attendance, no-show conditions, and replacement actions; access real-time tracking, movement-history, active-deployment, and geofence-alert views; use command dashboards, quick Inbox workflows, </w:t>
+        <w:t xml:space="preserve">The system shall enable supervisor users to monitor schedules, attendance, no-show conditions, and replacement actions; access near-real-time tracking, movement history, active deployment, and geofence-alert views; manage authorized operational resources including guard accounts, firearms, vehicles, and client sites; create guard accounts subject to administrator approval; access command dashboards, quick Inbox workflows, </w:t>
       </w:r>
       <w:r>
         <w:rPr>
           <w:rFonts w:ascii="Times New Roman" w:hAnsi="Times New Roman" w:cs="Times New Roman"/>
         </w:rPr>
-        <w:t>reports, alerts, and operational summaries</w:t>
-      </w:r>
-      <w:r>
-        <w:rPr>
-          <w:rFonts w:ascii="Times New Roman" w:hAnsi="Times New Roman" w:cs="Times New Roman"/>
-        </w:rPr>
-        <w:t>; manage ticketing and notification workflows; and submit authenticated feedback.</w:t>
+        <w:lastRenderedPageBreak/>
+        <w:t>reports, alerts, and operational summaries; manage ticketing and notification workflows; and submit authenticated feedback. Supervisors shall not create Supervisor, Admin, or Superadmin accounts, delete user accounts, or modify the system's role-permission policy.</w:t>
       </w:r>
     </w:p>
     <w:p>
@@ -25130,7 +25268,6 @@
         <w:rPr>
           <w:rFonts w:ascii="Times New Roman" w:hAnsi="Times New Roman" w:cs="Times New Roman"/>
         </w:rPr>
-        <w:lastRenderedPageBreak/>
         <w:t>The system shall enable guard users to access personal schedules and assigned resources, perform attendance-related actions, receive and respond to notifications, submit incident and support-related workflows, use self-scoped live tracking and movement-history features subject to policy and consent controls, access mission-critical field actions such as panic escalation, and submit authenticated feedback.</w:t>
       </w:r>
     </w:p>
@@ -25166,23 +25303,15 @@
           <w:rFonts w:ascii="Times New Roman" w:hAnsi="Times New Roman" w:cs="Times New Roman"/>
           <w:lang w:val="en-US"/>
         </w:rPr>
-        <w:t xml:space="preserve">The non-functional requirements of SENTINEL emphasize security, performance, usability, reliability, scalability, and compliance traceability. In terms of security, the system shall enforce strong authentication, role-based authorization, approval-gated access, auditable security events, account-protection controls, and abuse-resistance measures to preserve the integrity of operational data and workflows. In terms of performance, the system shall maintain responsive dashboards and timely operational updates suitable for near-real-time supervisory decision-making. With respect to usability, the system shall provide role-centered dashboards and modular user-interface navigation that reduce operator context switching, while further minimizing workflow friction </w:t>
-      </w:r>
-      <w:proofErr w:type="gramStart"/>
+        <w:t xml:space="preserve">The non-functional requirements of SENTINEL emphasize security, performance, usability, reliability, scalability, and compliance traceability. In terms of security, the system shall enforce strong authentication, role-based authorization, approval-gated access, auditable security events, account-protection controls, and abuse-resistance measures to preserve the integrity of operational data and workflows. In terms of performance, the system shall maintain responsive dashboards and timely operational updates suitable for near-real-time supervisory decision-making. With respect to usability, the system shall provide role-centered dashboards and modular user-interface navigation that reduce operator context switching, while further minimizing workflow friction through the use of a shared quick Inbox action for urgent operational work and timeline context. In terms of reliability, the system shall maintain secure session continuity, renewal, and termination behaviors to protect ongoing operations. With </w:t>
+      </w:r>
       <w:r>
         <w:rPr>
           <w:rFonts w:ascii="Times New Roman" w:hAnsi="Times New Roman" w:cs="Times New Roman"/>
           <w:lang w:val="en-US"/>
         </w:rPr>
-        <w:t>through the use of</w:t>
-      </w:r>
-      <w:proofErr w:type="gramEnd"/>
-      <w:r>
-        <w:rPr>
-          <w:rFonts w:ascii="Times New Roman" w:hAnsi="Times New Roman" w:cs="Times New Roman"/>
-          <w:lang w:val="en-US"/>
-        </w:rPr>
-        <w:t xml:space="preserve"> a shared quick Inbox action for urgent operational work and timeline context. In terms of reliability, the system shall maintain secure session continuity, renewal, and termination behaviors to protect ongoing operations. With respect to scalability, the system architecture shall remain API-driven and modular so that additional modules, integrations, and platform targets may be introduced without requiring a full redesign. Finally, for compliance traceability, legal acceptance and policy-governance events shall be recorded with timestamped metadata suitable for institutional review, accountability, and regulatory compliance.</w:t>
+        <w:lastRenderedPageBreak/>
+        <w:t>respect to scalability, the system architecture shall remain API-driven and modular so that additional modules, integrations, and platform targets may be introduced without requiring a full redesign. Finally, for compliance traceability, legal acceptance and policy-governance events shall be recorded with timestamped metadata suitable for institutional review, accountability, and regulatory compliance.</w:t>
       </w:r>
     </w:p>
     <w:p>
@@ -25736,27 +25865,7 @@
           <w:lang w:val="en-US"/>
           <w14:ligatures w14:val="none"/>
         </w:rPr>
-        <w:t xml:space="preserve">Figure 11 describes the Superadmin workflow as a system-wide governance loop. After login and access-state validation, the superadmin enters the command dashboard and reviews global KPIs, service health, and high-level command status. The role then branches into governance controls: role and permission policy administration, audit-log and forensic review, and cross-module governance actions. The decision node </w:t>
-      </w:r>
-      <w:proofErr w:type="gramStart"/>
-      <w:r>
-        <w:rPr>
-          <w:rFonts w:ascii="Times New Roman" w:eastAsia="Times New Roman" w:hAnsi="Times New Roman" w:cs="Times New Roman"/>
-          <w:kern w:val="0"/>
-          <w:lang w:val="en-US"/>
-          <w14:ligatures w14:val="none"/>
-        </w:rPr>
-        <w:t>checks for</w:t>
-      </w:r>
-      <w:proofErr w:type="gramEnd"/>
-      <w:r>
-        <w:rPr>
-          <w:rFonts w:ascii="Times New Roman" w:eastAsia="Times New Roman" w:hAnsi="Times New Roman" w:cs="Times New Roman"/>
-          <w:kern w:val="0"/>
-          <w:lang w:val="en-US"/>
-          <w14:ligatures w14:val="none"/>
-        </w:rPr>
-        <w:t xml:space="preserve"> policy, security, or governance issues. When issues exist, policy/access changes are applied, validated across modules and user-role boundaries, and re-evaluated through updated global status review. When no issues are detected, strategic oversight approvals proceed and the superadmin exits through secure logout.</w:t>
+        <w:t>Figure 11 describes the Superadmin workflow as a system-wide governance loop. After login and access-state validation, the superadmin reviews global KPIs, service health, user and role status, audit records, and governance conditions. When an issue is identified, the superadmin performs authorized user-management or governance actions within the system's predefined role-based access rules, validates the result, and continues oversight. The current implementation does not provide runtime editing of the role-permission policy.</w:t>
       </w:r>
       <w:r>
         <w:rPr>
@@ -25898,7 +26007,7 @@
         </w:rPr>
         <w:lastRenderedPageBreak/>
         <w:drawing>
-          <wp:anchor distT="0" distB="0" distL="114300" distR="114300" simplePos="0" relativeHeight="251688960" behindDoc="0" locked="0" layoutInCell="1" allowOverlap="1" wp14:anchorId="27C777B3" wp14:editId="11B35CF6">
+          <wp:anchor distT="0" distB="0" distL="114300" distR="114300" simplePos="0" relativeHeight="251688960" behindDoc="0" locked="0" layoutInCell="1" allowOverlap="1" wp14:anchorId="27C777B3" wp14:editId="326F622A">
             <wp:simplePos x="0" y="0"/>
             <wp:positionH relativeFrom="margin">
               <wp:align>center</wp:align>
@@ -25960,27 +26069,7 @@
           <w:lang w:val="en-US"/>
           <w14:ligatures w14:val="none"/>
         </w:rPr>
-        <w:t xml:space="preserve">This module will serve as the system governance layer for platform-wide control. </w:t>
-      </w:r>
-      <w:proofErr w:type="gramStart"/>
-      <w:r>
-        <w:rPr>
-          <w:rFonts w:ascii="Times New Roman" w:eastAsia="Times New Roman" w:hAnsi="Times New Roman" w:cs="Times New Roman"/>
-          <w:kern w:val="0"/>
-          <w:lang w:val="en-US"/>
-          <w14:ligatures w14:val="none"/>
-        </w:rPr>
-        <w:t>The Superadmin</w:t>
-      </w:r>
-      <w:proofErr w:type="gramEnd"/>
-      <w:r>
-        <w:rPr>
-          <w:rFonts w:ascii="Times New Roman" w:eastAsia="Times New Roman" w:hAnsi="Times New Roman" w:cs="Times New Roman"/>
-          <w:kern w:val="0"/>
-          <w:lang w:val="en-US"/>
-          <w14:ligatures w14:val="none"/>
-        </w:rPr>
-        <w:t xml:space="preserve"> will monitor global KPIs, review command-level operational status, and manage high-level oversight across all modules.</w:t>
+        <w:t>This module will serve as the system governance layer for platform-wide control. The Superadmin will monitor global KPIs, review command-level operational status, and manage high-level oversight across all modules.</w:t>
       </w:r>
     </w:p>
     <w:p>
@@ -26038,7 +26127,7 @@
           <w:lang w:val="en-US"/>
         </w:rPr>
         <w:drawing>
-          <wp:anchor distT="0" distB="0" distL="114300" distR="114300" simplePos="0" relativeHeight="251689984" behindDoc="0" locked="0" layoutInCell="1" allowOverlap="1" wp14:anchorId="1AAAC939" wp14:editId="399B30FE">
+          <wp:anchor distT="0" distB="0" distL="114300" distR="114300" simplePos="0" relativeHeight="251689984" behindDoc="0" locked="0" layoutInCell="1" allowOverlap="1" wp14:anchorId="1AAAC939" wp14:editId="00E6D469">
             <wp:simplePos x="0" y="0"/>
             <wp:positionH relativeFrom="margin">
               <wp:align>center</wp:align>
@@ -26146,7 +26235,7 @@
         </w:rPr>
         <w:lastRenderedPageBreak/>
         <w:drawing>
-          <wp:anchor distT="0" distB="0" distL="114300" distR="114300" simplePos="0" relativeHeight="251691008" behindDoc="0" locked="0" layoutInCell="1" allowOverlap="1" wp14:anchorId="78ECAFAD" wp14:editId="0ED26C8E">
+          <wp:anchor distT="0" distB="0" distL="114300" distR="114300" simplePos="0" relativeHeight="251691008" behindDoc="0" locked="0" layoutInCell="1" allowOverlap="1" wp14:anchorId="78ECAFAD" wp14:editId="5B0C4603">
             <wp:simplePos x="0" y="0"/>
             <wp:positionH relativeFrom="margin">
               <wp:align>center</wp:align>
@@ -26266,7 +26355,7 @@
           <w:lang w:val="en-US"/>
         </w:rPr>
         <w:drawing>
-          <wp:anchor distT="0" distB="0" distL="114300" distR="114300" simplePos="0" relativeHeight="251692032" behindDoc="0" locked="0" layoutInCell="1" allowOverlap="1" wp14:anchorId="33421A3E" wp14:editId="2848E052">
+          <wp:anchor distT="0" distB="0" distL="114300" distR="114300" simplePos="0" relativeHeight="251692032" behindDoc="0" locked="0" layoutInCell="1" allowOverlap="1" wp14:anchorId="33421A3E" wp14:editId="7CBC3363">
             <wp:simplePos x="0" y="0"/>
             <wp:positionH relativeFrom="margin">
               <wp:align>center</wp:align>
@@ -27404,7 +27493,7 @@
           <w:lang w:val="en-US"/>
         </w:rPr>
         <w:drawing>
-          <wp:anchor distT="0" distB="0" distL="114300" distR="114300" simplePos="0" relativeHeight="251702272" behindDoc="0" locked="0" layoutInCell="1" allowOverlap="1" wp14:anchorId="211F4DC7" wp14:editId="73373714">
+          <wp:anchor distT="0" distB="0" distL="114300" distR="114300" simplePos="0" relativeHeight="251702272" behindDoc="0" locked="0" layoutInCell="1" allowOverlap="1" wp14:anchorId="211F4DC7" wp14:editId="5048323D">
             <wp:simplePos x="0" y="0"/>
             <wp:positionH relativeFrom="margin">
               <wp:align>center</wp:align>
@@ -27512,7 +27601,7 @@
         </w:rPr>
         <w:lastRenderedPageBreak/>
         <w:drawing>
-          <wp:anchor distT="0" distB="0" distL="114300" distR="114300" simplePos="0" relativeHeight="251703296" behindDoc="0" locked="0" layoutInCell="1" allowOverlap="1" wp14:anchorId="4FC9977D" wp14:editId="0935E24C">
+          <wp:anchor distT="0" distB="0" distL="114300" distR="114300" simplePos="0" relativeHeight="251703296" behindDoc="0" locked="0" layoutInCell="1" allowOverlap="1" wp14:anchorId="4FC9977D" wp14:editId="4A844B43">
             <wp:simplePos x="0" y="0"/>
             <wp:positionH relativeFrom="margin">
               <wp:align>center</wp:align>
@@ -27572,23 +27661,7 @@
           <w:rFonts w:ascii="Times New Roman" w:hAnsi="Times New Roman" w:cs="Times New Roman"/>
           <w:lang w:val="en-US"/>
         </w:rPr>
-        <w:t xml:space="preserve">This module will serve as </w:t>
-      </w:r>
-      <w:proofErr w:type="gramStart"/>
-      <w:r>
-        <w:rPr>
-          <w:rFonts w:ascii="Times New Roman" w:hAnsi="Times New Roman" w:cs="Times New Roman"/>
-          <w:lang w:val="en-US"/>
-        </w:rPr>
-        <w:t>the</w:t>
-      </w:r>
-      <w:proofErr w:type="gramEnd"/>
-      <w:r>
-        <w:rPr>
-          <w:rFonts w:ascii="Times New Roman" w:hAnsi="Times New Roman" w:cs="Times New Roman"/>
-          <w:lang w:val="en-US"/>
-        </w:rPr>
-        <w:t xml:space="preserve"> structured user-input channel for usability and operational feedback. Users will submit feedback entries that support quality improvement and iterative refinement.</w:t>
+        <w:t>This module will serve as the structured user-input channel for usability and operational feedback. Users will submit feedback entries that support quality improvement and iterative refinement.</w:t>
       </w:r>
     </w:p>
     <w:p>
@@ -28105,23 +28178,7 @@
           <w:rFonts w:ascii="Times New Roman" w:hAnsi="Times New Roman" w:cs="Times New Roman"/>
           <w:lang w:val="en-US"/>
         </w:rPr>
-        <w:t xml:space="preserve">This module will serve as </w:t>
-      </w:r>
-      <w:proofErr w:type="gramStart"/>
-      <w:r>
-        <w:rPr>
-          <w:rFonts w:ascii="Times New Roman" w:hAnsi="Times New Roman" w:cs="Times New Roman"/>
-          <w:lang w:val="en-US"/>
-        </w:rPr>
-        <w:t>the</w:t>
-      </w:r>
-      <w:proofErr w:type="gramEnd"/>
-      <w:r>
-        <w:rPr>
-          <w:rFonts w:ascii="Times New Roman" w:hAnsi="Times New Roman" w:cs="Times New Roman"/>
-          <w:lang w:val="en-US"/>
-        </w:rPr>
-        <w:t xml:space="preserve"> armored vehicle management workspace for transport assets. Authorized users will maintain vehicle records and deployment-relevant fleet details.</w:t>
+        <w:t>This module will serve as the armored vehicle management workspace for transport assets. Authorized users will maintain vehicle records and deployment-relevant fleet details.</w:t>
       </w:r>
     </w:p>
     <w:p>
@@ -28276,7 +28333,7 @@
           <w:lang w:val="en-US"/>
         </w:rPr>
         <w:drawing>
-          <wp:anchor distT="0" distB="0" distL="114300" distR="114300" simplePos="0" relativeHeight="251710464" behindDoc="0" locked="0" layoutInCell="1" allowOverlap="1" wp14:anchorId="620D7121" wp14:editId="597C1B73">
+          <wp:anchor distT="0" distB="0" distL="114300" distR="114300" simplePos="0" relativeHeight="251710464" behindDoc="0" locked="0" layoutInCell="1" allowOverlap="1" wp14:anchorId="620D7121" wp14:editId="52EF89BF">
             <wp:simplePos x="0" y="0"/>
             <wp:positionH relativeFrom="margin">
               <wp:align>center</wp:align>
@@ -28397,7 +28454,7 @@
         </w:rPr>
         <w:lastRenderedPageBreak/>
         <w:drawing>
-          <wp:anchor distT="0" distB="0" distL="114300" distR="114300" simplePos="0" relativeHeight="251711488" behindDoc="0" locked="0" layoutInCell="1" allowOverlap="1" wp14:anchorId="7E50BC07" wp14:editId="15B4F087">
+          <wp:anchor distT="0" distB="0" distL="114300" distR="114300" simplePos="0" relativeHeight="251711488" behindDoc="0" locked="0" layoutInCell="1" allowOverlap="1" wp14:anchorId="7E50BC07" wp14:editId="6012F937">
             <wp:simplePos x="0" y="0"/>
             <wp:positionH relativeFrom="margin">
               <wp:align>center</wp:align>
@@ -28494,7 +28551,7 @@
           <w:lang w:val="en-US"/>
         </w:rPr>
         <w:drawing>
-          <wp:anchor distT="0" distB="0" distL="114300" distR="114300" simplePos="0" relativeHeight="251712512" behindDoc="0" locked="0" layoutInCell="1" allowOverlap="1" wp14:anchorId="4C3BE49A" wp14:editId="0265C7F7">
+          <wp:anchor distT="0" distB="0" distL="114300" distR="114300" simplePos="0" relativeHeight="251712512" behindDoc="0" locked="0" layoutInCell="1" allowOverlap="1" wp14:anchorId="4C3BE49A" wp14:editId="6275E65A">
             <wp:simplePos x="0" y="0"/>
             <wp:positionH relativeFrom="margin">
               <wp:align>center</wp:align>
@@ -28602,7 +28659,7 @@
         </w:rPr>
         <w:lastRenderedPageBreak/>
         <w:drawing>
-          <wp:anchor distT="0" distB="0" distL="114300" distR="114300" simplePos="0" relativeHeight="251713536" behindDoc="0" locked="0" layoutInCell="1" allowOverlap="1" wp14:anchorId="13A6D699" wp14:editId="6EF32F2D">
+          <wp:anchor distT="0" distB="0" distL="114300" distR="114300" simplePos="0" relativeHeight="251713536" behindDoc="0" locked="0" layoutInCell="1" allowOverlap="1" wp14:anchorId="13A6D699" wp14:editId="618C67C5">
             <wp:simplePos x="0" y="0"/>
             <wp:positionH relativeFrom="margin">
               <wp:align>center</wp:align>
@@ -28955,29 +29012,7 @@
           <w:kern w:val="0"/>
           <w14:ligatures w14:val="none"/>
         </w:rPr>
-        <w:t xml:space="preserve">Enabling </w:t>
-      </w:r>
-      <w:proofErr w:type="gramStart"/>
-      <w:r>
-        <w:rPr>
-          <w:rFonts w:ascii="Times New Roman" w:eastAsia="Times New Roman" w:hAnsi="Times New Roman" w:cs="Times New Roman"/>
-          <w:i/>
-          <w:iCs/>
-          <w:kern w:val="0"/>
-          <w14:ligatures w14:val="none"/>
-        </w:rPr>
-        <w:t>high performance</w:t>
-      </w:r>
-      <w:proofErr w:type="gramEnd"/>
-      <w:r>
-        <w:rPr>
-          <w:rFonts w:ascii="Times New Roman" w:eastAsia="Times New Roman" w:hAnsi="Times New Roman" w:cs="Times New Roman"/>
-          <w:i/>
-          <w:iCs/>
-          <w:kern w:val="0"/>
-          <w14:ligatures w14:val="none"/>
-        </w:rPr>
-        <w:t xml:space="preserve"> fog computing through fog-2-fog coordination model.</w:t>
+        <w:t>Enabling high performance fog computing through fog-2-fog coordination model.</w:t>
       </w:r>
       <w:r>
         <w:rPr>
@@ -33214,90 +33249,90 @@
   </w:abstractNum>
   <w:abstractNum w:abstractNumId="27" w15:restartNumberingAfterBreak="0">
     <w:nsid w:val="52F017AE"/>
-    <w:multiLevelType w:val="hybridMultilevel"/>
-    <w:tmpl w:val="95DA5BA8"/>
-    <w:lvl w:ilvl="0" w:tplc="0409000F">
+    <w:multiLevelType w:val="multilevel"/>
+    <w:tmpl w:val="0409001F"/>
+    <w:lvl w:ilvl="0">
       <w:start w:val="1"/>
       <w:numFmt w:val="decimal"/>
       <w:lvlText w:val="%1."/>
       <w:lvlJc w:val="left"/>
       <w:pPr>
-        <w:ind w:left="720" w:hanging="360"/>
+        <w:ind w:left="360" w:hanging="360"/>
       </w:pPr>
       <w:rPr>
         <w:rFonts w:hint="default"/>
       </w:rPr>
     </w:lvl>
-    <w:lvl w:ilvl="1" w:tplc="04090019" w:tentative="1">
-      <w:start w:val="1"/>
-      <w:numFmt w:val="lowerLetter"/>
-      <w:lvlText w:val="%2."/>
-      <w:lvlJc w:val="left"/>
-      <w:pPr>
-        <w:ind w:left="1440" w:hanging="360"/>
-      </w:pPr>
-    </w:lvl>
-    <w:lvl w:ilvl="2" w:tplc="0409001B" w:tentative="1">
-      <w:start w:val="1"/>
-      <w:numFmt w:val="lowerRoman"/>
-      <w:lvlText w:val="%3."/>
-      <w:lvlJc w:val="right"/>
-      <w:pPr>
-        <w:ind w:left="2160" w:hanging="180"/>
-      </w:pPr>
-    </w:lvl>
-    <w:lvl w:ilvl="3" w:tplc="0409000F" w:tentative="1">
+    <w:lvl w:ilvl="1">
       <w:start w:val="1"/>
       <w:numFmt w:val="decimal"/>
-      <w:lvlText w:val="%4."/>
+      <w:lvlText w:val="%1.%2."/>
       <w:lvlJc w:val="left"/>
       <w:pPr>
-        <w:ind w:left="2880" w:hanging="360"/>
+        <w:ind w:left="792" w:hanging="432"/>
       </w:pPr>
     </w:lvl>
-    <w:lvl w:ilvl="4" w:tplc="04090019" w:tentative="1">
-      <w:start w:val="1"/>
-      <w:numFmt w:val="lowerLetter"/>
-      <w:lvlText w:val="%5."/>
-      <w:lvlJc w:val="left"/>
-      <w:pPr>
-        <w:ind w:left="3600" w:hanging="360"/>
-      </w:pPr>
-    </w:lvl>
-    <w:lvl w:ilvl="5" w:tplc="0409001B" w:tentative="1">
-      <w:start w:val="1"/>
-      <w:numFmt w:val="lowerRoman"/>
-      <w:lvlText w:val="%6."/>
-      <w:lvlJc w:val="right"/>
-      <w:pPr>
-        <w:ind w:left="4320" w:hanging="180"/>
-      </w:pPr>
-    </w:lvl>
-    <w:lvl w:ilvl="6" w:tplc="0409000F" w:tentative="1">
+    <w:lvl w:ilvl="2">
       <w:start w:val="1"/>
       <w:numFmt w:val="decimal"/>
-      <w:lvlText w:val="%7."/>
+      <w:lvlText w:val="%1.%2.%3."/>
       <w:lvlJc w:val="left"/>
       <w:pPr>
-        <w:ind w:left="5040" w:hanging="360"/>
+        <w:ind w:left="1224" w:hanging="504"/>
       </w:pPr>
     </w:lvl>
-    <w:lvl w:ilvl="7" w:tplc="04090019" w:tentative="1">
+    <w:lvl w:ilvl="3">
       <w:start w:val="1"/>
-      <w:numFmt w:val="lowerLetter"/>
-      <w:lvlText w:val="%8."/>
+      <w:numFmt w:val="decimal"/>
+      <w:lvlText w:val="%1.%2.%3.%4."/>
       <w:lvlJc w:val="left"/>
       <w:pPr>
-        <w:ind w:left="5760" w:hanging="360"/>
+        <w:ind w:left="1728" w:hanging="648"/>
       </w:pPr>
     </w:lvl>
-    <w:lvl w:ilvl="8" w:tplc="0409001B" w:tentative="1">
+    <w:lvl w:ilvl="4">
       <w:start w:val="1"/>
-      <w:numFmt w:val="lowerRoman"/>
-      <w:lvlText w:val="%9."/>
-      <w:lvlJc w:val="right"/>
-      <w:pPr>
-        <w:ind w:left="6480" w:hanging="180"/>
+      <w:numFmt w:val="decimal"/>
+      <w:lvlText w:val="%1.%2.%3.%4.%5."/>
+      <w:lvlJc w:val="left"/>
+      <w:pPr>
+        <w:ind w:left="2232" w:hanging="792"/>
+      </w:pPr>
+    </w:lvl>
+    <w:lvl w:ilvl="5">
+      <w:start w:val="1"/>
+      <w:numFmt w:val="decimal"/>
+      <w:lvlText w:val="%1.%2.%3.%4.%5.%6."/>
+      <w:lvlJc w:val="left"/>
+      <w:pPr>
+        <w:ind w:left="2736" w:hanging="936"/>
+      </w:pPr>
+    </w:lvl>
+    <w:lvl w:ilvl="6">
+      <w:start w:val="1"/>
+      <w:numFmt w:val="decimal"/>
+      <w:lvlText w:val="%1.%2.%3.%4.%5.%6.%7."/>
+      <w:lvlJc w:val="left"/>
+      <w:pPr>
+        <w:ind w:left="3240" w:hanging="1080"/>
+      </w:pPr>
+    </w:lvl>
+    <w:lvl w:ilvl="7">
+      <w:start w:val="1"/>
+      <w:numFmt w:val="decimal"/>
+      <w:lvlText w:val="%1.%2.%3.%4.%5.%6.%7.%8."/>
+      <w:lvlJc w:val="left"/>
+      <w:pPr>
+        <w:ind w:left="3744" w:hanging="1224"/>
+      </w:pPr>
+    </w:lvl>
+    <w:lvl w:ilvl="8">
+      <w:start w:val="1"/>
+      <w:numFmt w:val="decimal"/>
+      <w:lvlText w:val="%1.%2.%3.%4.%5.%6.%7.%8.%9."/>
+      <w:lvlJc w:val="left"/>
+      <w:pPr>
+        <w:ind w:left="4320" w:hanging="1440"/>
       </w:pPr>
     </w:lvl>
   </w:abstractNum>

</xml_diff>